<commit_message>
sem 6 some tasks
</commit_message>
<xml_diff>
--- a/Semester-6/UI-UX/Lab Work/ass_3.docx
+++ b/Semester-6/UI-UX/Lab Work/ass_3.docx
@@ -1,6 +1,6 @@
 
 <file path=word/document.xml><?xml version="1.0" encoding="utf-8"?>
-<w:document xmlns:mc="http://schemas.openxmlformats.org/markup-compatibility/2006" xmlns:ve="http://schemas.openxmlformats.org/markup-compatibility/2006" xmlns:o="urn:schemas-microsoft-com:office:office" xmlns:r="http://schemas.openxmlformats.org/officeDocument/2006/relationships" xmlns:m="http://schemas.openxmlformats.org/officeDocument/2006/math" xmlns:v="urn:schemas-microsoft-com:vml" xmlns:wp="http://schemas.openxmlformats.org/drawingml/2006/wordprocessingDrawing" xmlns:w10="urn:schemas-microsoft-com:office:word" xmlns:w="http://schemas.openxmlformats.org/wordprocessingml/2006/main" xmlns:wne="http://schemas.microsoft.com/office/word/2006/wordml" xmlns:a="http://schemas.openxmlformats.org/drawingml/2006/main" xmlns:pic="http://schemas.openxmlformats.org/drawingml/2006/picture" xmlns:wpg="http://schemas.microsoft.com/office/word/2010/wordprocessingGroup" xmlns:wps="http://schemas.microsoft.com/office/word/2010/wordprocessingShape" xmlns:w14="http://schemas.microsoft.com/office/word/2010/wordml" mc:Ignorable="w14" xml:space="preserve">
+<w:document xmlns:wpc="http://schemas.microsoft.com/office/word/2010/wordprocessingCanvas" xmlns:cx="http://schemas.microsoft.com/office/drawing/2014/chartex" xmlns:cx1="http://schemas.microsoft.com/office/drawing/2015/9/8/chartex" xmlns:cx2="http://schemas.microsoft.com/office/drawing/2015/10/21/chartex" xmlns:cx3="http://schemas.microsoft.com/office/drawing/2016/5/9/chartex" xmlns:cx4="http://schemas.microsoft.com/office/drawing/2016/5/10/chartex" xmlns:cx5="http://schemas.microsoft.com/office/drawing/2016/5/11/chartex" xmlns:cx6="http://schemas.microsoft.com/office/drawing/2016/5/12/chartex" xmlns:cx7="http://schemas.microsoft.com/office/drawing/2016/5/13/chartex" xmlns:cx8="http://schemas.microsoft.com/office/drawing/2016/5/14/chartex" xmlns:mc="http://schemas.openxmlformats.org/markup-compatibility/2006" xmlns:aink="http://schemas.microsoft.com/office/drawing/2016/ink" xmlns:am3d="http://schemas.microsoft.com/office/drawing/2017/model3d" xmlns:o="urn:schemas-microsoft-com:office:office" xmlns:oel="http://schemas.microsoft.com/office/2019/extlst" xmlns:r="http://schemas.openxmlformats.org/officeDocument/2006/relationships" xmlns:m="http://schemas.openxmlformats.org/officeDocument/2006/math" xmlns:v="urn:schemas-microsoft-com:vml" xmlns:wp14="http://schemas.microsoft.com/office/word/2010/wordprocessingDrawing" xmlns:wp="http://schemas.openxmlformats.org/drawingml/2006/wordprocessingDrawing" xmlns:w10="urn:schemas-microsoft-com:office:word" xmlns:w="http://schemas.openxmlformats.org/wordprocessingml/2006/main" xmlns:w14="http://schemas.microsoft.com/office/word/2010/wordml" xmlns:w15="http://schemas.microsoft.com/office/word/2012/wordml" xmlns:w16cex="http://schemas.microsoft.com/office/word/2018/wordml/cex" xmlns:w16cid="http://schemas.microsoft.com/office/word/2016/wordml/cid" xmlns:w16="http://schemas.microsoft.com/office/word/2018/wordml" xmlns:w16du="http://schemas.microsoft.com/office/word/2023/wordml/word16du" xmlns:w16sdtdh="http://schemas.microsoft.com/office/word/2020/wordml/sdtdatahash" xmlns:w16sdtfl="http://schemas.microsoft.com/office/word/2024/wordml/sdtformatlock" xmlns:w16se="http://schemas.microsoft.com/office/word/2015/wordml/symex" xmlns:wpg="http://schemas.microsoft.com/office/word/2010/wordprocessingGroup" xmlns:wpi="http://schemas.microsoft.com/office/word/2010/wordprocessingInk" xmlns:wne="http://schemas.microsoft.com/office/word/2006/wordml" xmlns:wps="http://schemas.microsoft.com/office/word/2010/wordprocessingShape" mc:Ignorable="w14 w15 w16se w16cid w16 w16cex w16sdtdh w16sdtfl w16du wp14">
   <w:body>
     <w:p>
       <w:pPr>
@@ -14,63 +14,39 @@
     </w:p>
     <w:p>
       <w:pPr>
+        <w:pStyle w:val="Heading2"/>
         <w:tabs>
-          <w:tab w:pos="9510" w:val="left" w:leader="none"/>
+          <w:tab w:val="left" w:pos="787"/>
         </w:tabs>
-        <w:spacing w:before="0"/>
-        <w:ind w:left="8723" w:right="0" w:firstLine="0"/>
-        <w:jc w:val="left"/>
-        <w:rPr>
-          <w:b/>
-          <w:sz w:val="24"/>
-        </w:rPr>
+        <w:jc w:val="right"/>
       </w:pPr>
       <w:r>
         <w:rPr>
-          <w:b/>
           <w:spacing w:val="-4"/>
-          <w:sz w:val="24"/>
         </w:rPr>
         <w:t>Date:</w:t>
       </w:r>
       <w:r>
-        <w:rPr>
-          <w:b/>
-          <w:sz w:val="24"/>
-        </w:rPr>
         <w:tab/>
+        <w:t>0</w:t>
+      </w:r>
+      <w:r>
+        <w:t>9</w:t>
+      </w:r>
+      <w:r>
         <w:t>/</w:t>
       </w:r>
       <w:r>
         <w:rPr>
-          <w:b/>
-          <w:spacing w:val="51"/>
-          <w:sz w:val="24"/>
-        </w:rPr>
-        <w:t> </w:t>
-      </w:r>
-      <w:r>
-        <w:rPr>
-          <w:b/>
-          <w:sz w:val="24"/>
-        </w:rPr>
-        <w:t>/</w:t>
-      </w:r>
-      <w:r>
-        <w:rPr>
-          <w:b/>
-          <w:spacing w:val="1"/>
-          <w:sz w:val="24"/>
-        </w:rPr>
-        <w:t> </w:t>
-      </w:r>
-      <w:r>
-        <w:rPr>
-          <w:b/>
+          <w:spacing w:val="53"/>
+        </w:rPr>
+        <w:t>12</w:t>
+      </w:r>
+      <w:r>
+        <w:rPr>
           <w:spacing w:val="-4"/>
-          <w:sz w:val="24"/>
-        </w:rPr>
-        <w:t>2025</w:t>
+        </w:rPr>
+        <w:t>/2025</w:t>
       </w:r>
     </w:p>
     <w:p>
@@ -78,24 +54,22 @@
         <w:pStyle w:val="Heading2"/>
       </w:pPr>
       <w:r>
-        <w:rPr/>
         <w:t>Lab</w:t>
       </w:r>
       <w:r>
         <w:rPr>
           <w:spacing w:val="-10"/>
         </w:rPr>
-        <w:t> </w:t>
-      </w:r>
-      <w:r>
-        <w:rPr/>
+        <w:t xml:space="preserve"> </w:t>
+      </w:r>
+      <w:r>
         <w:t>Practical</w:t>
       </w:r>
       <w:r>
         <w:rPr>
           <w:spacing w:val="-7"/>
         </w:rPr>
-        <w:t> </w:t>
+        <w:t xml:space="preserve"> </w:t>
       </w:r>
       <w:r>
         <w:rPr>
@@ -111,34 +85,31 @@
         <w:ind w:left="12"/>
       </w:pPr>
       <w:r>
-        <w:rPr/>
         <w:t>Design</w:t>
       </w:r>
       <w:r>
         <w:rPr>
           <w:spacing w:val="-7"/>
         </w:rPr>
-        <w:t> </w:t>
-      </w:r>
-      <w:r>
-        <w:rPr/>
+        <w:t xml:space="preserve"> </w:t>
+      </w:r>
+      <w:r>
         <w:t>a</w:t>
       </w:r>
       <w:r>
         <w:rPr>
           <w:spacing w:val="-8"/>
         </w:rPr>
-        <w:t> </w:t>
-      </w:r>
-      <w:r>
-        <w:rPr/>
+        <w:t xml:space="preserve"> </w:t>
+      </w:r>
+      <w:r>
         <w:t>simple</w:t>
       </w:r>
       <w:r>
         <w:rPr>
           <w:spacing w:val="-5"/>
         </w:rPr>
-        <w:t> </w:t>
+        <w:t xml:space="preserve"> </w:t>
       </w:r>
       <w:r>
         <w:rPr>
@@ -151,7 +122,7 @@
           <w:b/>
           <w:spacing w:val="-9"/>
         </w:rPr>
-        <w:t> </w:t>
+        <w:t xml:space="preserve"> </w:t>
       </w:r>
       <w:r>
         <w:rPr>
@@ -164,107 +135,97 @@
           <w:b/>
           <w:spacing w:val="-9"/>
         </w:rPr>
-        <w:t> </w:t>
-      </w:r>
-      <w:r>
-        <w:rPr/>
+        <w:t xml:space="preserve"> </w:t>
+      </w:r>
+      <w:r>
         <w:t>(3</w:t>
       </w:r>
       <w:r>
         <w:rPr>
           <w:spacing w:val="-5"/>
         </w:rPr>
-        <w:t> </w:t>
-      </w:r>
-      <w:r>
-        <w:rPr/>
+        <w:t xml:space="preserve"> </w:t>
+      </w:r>
+      <w:r>
         <w:t>screens)</w:t>
       </w:r>
       <w:r>
         <w:rPr>
           <w:spacing w:val="-6"/>
         </w:rPr>
-        <w:t> </w:t>
-      </w:r>
-      <w:r>
-        <w:rPr/>
+        <w:t xml:space="preserve"> </w:t>
+      </w:r>
+      <w:r>
         <w:t>using</w:t>
       </w:r>
       <w:r>
         <w:rPr>
           <w:spacing w:val="-6"/>
         </w:rPr>
-        <w:t> </w:t>
-      </w:r>
-      <w:r>
-        <w:rPr/>
+        <w:t xml:space="preserve"> </w:t>
+      </w:r>
+      <w:r>
         <w:t>Basic</w:t>
       </w:r>
       <w:r>
         <w:rPr>
           <w:spacing w:val="-9"/>
         </w:rPr>
-        <w:t> </w:t>
-      </w:r>
-      <w:r>
-        <w:rPr/>
+        <w:t xml:space="preserve"> </w:t>
+      </w:r>
+      <w:r>
         <w:t>Tools</w:t>
       </w:r>
       <w:r>
         <w:rPr>
           <w:spacing w:val="-6"/>
         </w:rPr>
-        <w:t> </w:t>
-      </w:r>
-      <w:r>
-        <w:rPr/>
+        <w:t xml:space="preserve"> </w:t>
+      </w:r>
+      <w:r>
         <w:t>Position,</w:t>
       </w:r>
       <w:r>
         <w:rPr>
           <w:spacing w:val="-6"/>
         </w:rPr>
-        <w:t> </w:t>
-      </w:r>
-      <w:r>
-        <w:rPr/>
+        <w:t xml:space="preserve"> </w:t>
+      </w:r>
+      <w:r>
         <w:t>Size,</w:t>
       </w:r>
       <w:r>
         <w:rPr>
           <w:spacing w:val="-5"/>
         </w:rPr>
-        <w:t> </w:t>
-      </w:r>
-      <w:r>
-        <w:rPr/>
+        <w:t xml:space="preserve"> </w:t>
+      </w:r>
+      <w:r>
         <w:t>Rotation,</w:t>
       </w:r>
       <w:r>
         <w:rPr>
           <w:spacing w:val="-6"/>
         </w:rPr>
-        <w:t> </w:t>
-      </w:r>
-      <w:r>
-        <w:rPr/>
+        <w:t xml:space="preserve"> </w:t>
+      </w:r>
+      <w:r>
         <w:t>Color</w:t>
       </w:r>
       <w:r>
         <w:rPr>
           <w:spacing w:val="-9"/>
         </w:rPr>
-        <w:t> </w:t>
-      </w:r>
-      <w:r>
-        <w:rPr/>
+        <w:t xml:space="preserve"> </w:t>
+      </w:r>
+      <w:r>
         <w:t>Styles,</w:t>
       </w:r>
       <w:r>
         <w:rPr>
           <w:spacing w:val="-7"/>
         </w:rPr>
-        <w:t> </w:t>
+        <w:t xml:space="preserve"> </w:t>
       </w:r>
       <w:r>
         <w:rPr>
@@ -279,24 +240,22 @@
         <w:spacing w:before="23"/>
       </w:pPr>
       <w:r>
-        <w:rPr/>
         <w:t>Practical</w:t>
       </w:r>
       <w:r>
         <w:rPr>
           <w:spacing w:val="-10"/>
         </w:rPr>
-        <w:t> </w:t>
-      </w:r>
-      <w:r>
-        <w:rPr/>
+        <w:t xml:space="preserve"> </w:t>
+      </w:r>
+      <w:r>
         <w:t>Assignment</w:t>
       </w:r>
       <w:r>
         <w:rPr>
           <w:spacing w:val="-9"/>
         </w:rPr>
-        <w:t> </w:t>
+        <w:t xml:space="preserve"> </w:t>
       </w:r>
       <w:r>
         <w:rPr>
@@ -312,134 +271,121 @@
         <w:ind w:left="12"/>
       </w:pPr>
       <w:r>
-        <w:rPr/>
         <w:t>Design</w:t>
       </w:r>
       <w:r>
         <w:rPr>
           <w:spacing w:val="-5"/>
         </w:rPr>
-        <w:t> </w:t>
-      </w:r>
-      <w:r>
-        <w:rPr/>
+        <w:t xml:space="preserve"> </w:t>
+      </w:r>
+      <w:r>
         <w:t>the</w:t>
       </w:r>
       <w:r>
         <w:rPr>
           <w:spacing w:val="-3"/>
         </w:rPr>
-        <w:t> </w:t>
-      </w:r>
-      <w:r>
-        <w:rPr/>
+        <w:t xml:space="preserve"> </w:t>
+      </w:r>
+      <w:r>
         <w:t>'Login</w:t>
       </w:r>
       <w:r>
         <w:rPr>
           <w:spacing w:val="-6"/>
         </w:rPr>
-        <w:t> </w:t>
-      </w:r>
-      <w:r>
-        <w:rPr/>
+        <w:t xml:space="preserve"> </w:t>
+      </w:r>
+      <w:r>
         <w:t>Screen'.</w:t>
       </w:r>
       <w:r>
         <w:rPr>
           <w:spacing w:val="-2"/>
         </w:rPr>
-        <w:t> </w:t>
-      </w:r>
-      <w:r>
-        <w:rPr/>
+        <w:t xml:space="preserve"> </w:t>
+      </w:r>
+      <w:r>
         <w:t>Focus</w:t>
       </w:r>
       <w:r>
         <w:rPr>
           <w:spacing w:val="-7"/>
         </w:rPr>
-        <w:t> </w:t>
-      </w:r>
-      <w:r>
-        <w:rPr/>
+        <w:t xml:space="preserve"> </w:t>
+      </w:r>
+      <w:r>
         <w:t>on</w:t>
       </w:r>
       <w:r>
         <w:rPr>
           <w:spacing w:val="-4"/>
         </w:rPr>
-        <w:t> </w:t>
-      </w:r>
-      <w:r>
-        <w:rPr/>
+        <w:t xml:space="preserve"> </w:t>
+      </w:r>
+      <w:r>
         <w:t>tools</w:t>
       </w:r>
       <w:r>
         <w:rPr>
           <w:spacing w:val="-4"/>
         </w:rPr>
-        <w:t> </w:t>
-      </w:r>
-      <w:r>
-        <w:rPr/>
+        <w:t xml:space="preserve"> </w:t>
+      </w:r>
+      <w:r>
         <w:t>from</w:t>
       </w:r>
       <w:r>
         <w:rPr>
           <w:spacing w:val="-3"/>
         </w:rPr>
-        <w:t> </w:t>
-      </w:r>
-      <w:r>
-        <w:rPr/>
+        <w:t xml:space="preserve"> </w:t>
+      </w:r>
+      <w:r>
         <w:t>Position,</w:t>
       </w:r>
       <w:r>
         <w:rPr>
           <w:spacing w:val="-4"/>
         </w:rPr>
-        <w:t> </w:t>
-      </w:r>
-      <w:r>
-        <w:rPr/>
+        <w:t xml:space="preserve"> </w:t>
+      </w:r>
+      <w:r>
         <w:t>Size,</w:t>
       </w:r>
       <w:r>
         <w:rPr>
           <w:spacing w:val="-3"/>
         </w:rPr>
-        <w:t> </w:t>
-      </w:r>
-      <w:r>
-        <w:rPr/>
+        <w:t xml:space="preserve"> </w:t>
+      </w:r>
+      <w:r>
         <w:t>Rotation,</w:t>
       </w:r>
       <w:r>
         <w:rPr>
           <w:spacing w:val="-4"/>
         </w:rPr>
-        <w:t> </w:t>
-      </w:r>
-      <w:r>
-        <w:rPr/>
+        <w:t xml:space="preserve"> </w:t>
+      </w:r>
+      <w:r>
         <w:t>Color</w:t>
       </w:r>
       <w:r>
         <w:rPr>
           <w:spacing w:val="-3"/>
         </w:rPr>
-        <w:t> </w:t>
-      </w:r>
-      <w:r>
-        <w:rPr/>
+        <w:t xml:space="preserve"> </w:t>
+      </w:r>
+      <w:r>
         <w:t>Styles,</w:t>
       </w:r>
       <w:r>
         <w:rPr>
           <w:spacing w:val="-3"/>
         </w:rPr>
-        <w:t> </w:t>
+        <w:t xml:space="preserve"> </w:t>
       </w:r>
       <w:r>
         <w:rPr>
@@ -457,8 +403,27 @@
     <w:p>
       <w:pPr>
         <w:spacing w:before="1"/>
-        <w:ind w:left="12" w:right="0" w:firstLine="0"/>
-        <w:jc w:val="left"/>
+        <w:ind w:left="12"/>
+        <w:rPr>
+          <w:b/>
+          <w:spacing w:val="-2"/>
+          <w:sz w:val="28"/>
+        </w:rPr>
+      </w:pPr>
+      <w:r>
+        <w:rPr>
+          <w:b/>
+          <w:spacing w:val="-2"/>
+          <w:sz w:val="28"/>
+        </w:rPr>
+        <w:t>Description:</w:t>
+      </w:r>
+    </w:p>
+    <w:p>
+      <w:pPr>
+        <w:spacing w:before="1"/>
+        <w:ind w:left="12"/>
+        <w:jc w:val="center"/>
         <w:rPr>
           <w:b/>
           <w:sz w:val="28"/>
@@ -467,33 +432,32 @@
       <w:r>
         <w:rPr>
           <w:b/>
+          <w:noProof/>
           <w:sz w:val="28"/>
         </w:rPr>
         <w:drawing>
-          <wp:anchor distT="0" distB="0" distL="0" distR="0" allowOverlap="1" layoutInCell="1" locked="0" behindDoc="1" simplePos="0" relativeHeight="487587840">
-            <wp:simplePos x="0" y="0"/>
-            <wp:positionH relativeFrom="page">
-              <wp:posOffset>2901060</wp:posOffset>
-            </wp:positionH>
-            <wp:positionV relativeFrom="paragraph">
-              <wp:posOffset>225595</wp:posOffset>
-            </wp:positionV>
-            <wp:extent cx="1769899" cy="5607558"/>
-            <wp:effectExtent l="0" t="0" r="0" b="0"/>
-            <wp:wrapTopAndBottom/>
-            <wp:docPr id="7" name="Image 7"/>
+          <wp:inline distT="0" distB="0" distL="0" distR="0" wp14:anchorId="426CE997" wp14:editId="12E0B21C">
+            <wp:extent cx="2789015" cy="5425440"/>
+            <wp:effectExtent l="0" t="0" r="0" b="3810"/>
+            <wp:docPr id="315351614" name="Picture 6"/>
             <wp:cNvGraphicFramePr>
-              <a:graphicFrameLocks/>
+              <a:graphicFrameLocks xmlns:a="http://schemas.openxmlformats.org/drawingml/2006/main" noChangeAspect="1"/>
             </wp:cNvGraphicFramePr>
-            <a:graphic>
+            <a:graphic xmlns:a="http://schemas.openxmlformats.org/drawingml/2006/main">
               <a:graphicData uri="http://schemas.openxmlformats.org/drawingml/2006/picture">
-                <pic:pic>
+                <pic:pic xmlns:pic="http://schemas.openxmlformats.org/drawingml/2006/picture">
                   <pic:nvPicPr>
-                    <pic:cNvPr id="7" name="Image 7"/>
+                    <pic:cNvPr id="315351614" name="Picture 315351614"/>
                     <pic:cNvPicPr/>
                   </pic:nvPicPr>
                   <pic:blipFill>
-                    <a:blip r:embed="rId7" cstate="print"/>
+                    <a:blip r:embed="rId6">
+                      <a:extLst>
+                        <a:ext uri="{28A0092B-C50C-407E-A947-70E740481C1C}">
+                          <a14:useLocalDpi xmlns:a14="http://schemas.microsoft.com/office/drawing/2010/main" val="0"/>
+                        </a:ext>
+                      </a:extLst>
+                    </a:blip>
                     <a:stretch>
                       <a:fillRect/>
                     </a:stretch>
@@ -501,142 +465,7 @@
                   <pic:spPr>
                     <a:xfrm>
                       <a:off x="0" y="0"/>
-                      <a:ext cx="1769899" cy="5607558"/>
-                    </a:xfrm>
-                    <a:prstGeom prst="rect">
-                      <a:avLst/>
-                    </a:prstGeom>
-                  </pic:spPr>
-                </pic:pic>
-              </a:graphicData>
-            </a:graphic>
-          </wp:anchor>
-        </w:drawing>
-      </w:r>
-      <w:r>
-        <w:rPr>
-          <w:b/>
-          <w:spacing w:val="-2"/>
-          <w:sz w:val="28"/>
-        </w:rPr>
-        <w:t>Description:</w:t>
-      </w:r>
-    </w:p>
-    <w:p>
-      <w:pPr>
-        <w:pStyle w:val="Heading1"/>
-        <w:spacing w:before="128"/>
-        <w:ind w:right="1"/>
-        <w:jc w:val="center"/>
-      </w:pPr>
-      <w:r>
-        <w:rPr>
-          <w:color w:val="2E5395"/>
-        </w:rPr>
-        <w:t>Home</w:t>
-      </w:r>
-      <w:r>
-        <w:rPr>
-          <w:color w:val="2E5395"/>
-          <w:spacing w:val="-11"/>
-        </w:rPr>
-        <w:t> </w:t>
-      </w:r>
-      <w:r>
-        <w:rPr>
-          <w:color w:val="2E5395"/>
-          <w:spacing w:val="-2"/>
-        </w:rPr>
-        <w:t>Screen</w:t>
-      </w:r>
-    </w:p>
-    <w:p>
-      <w:pPr>
-        <w:pStyle w:val="Heading1"/>
-        <w:spacing w:after="0"/>
-        <w:jc w:val="center"/>
-        <w:sectPr>
-          <w:headerReference w:type="default" r:id="rId5"/>
-          <w:footerReference w:type="default" r:id="rId6"/>
-          <w:type w:val="continuous"/>
-          <w:pgSz w:w="11910" w:h="16840"/>
-          <w:pgMar w:header="1039" w:footer="1401" w:top="2080" w:bottom="1600" w:left="708" w:right="708"/>
-          <w:pgNumType w:start="1"/>
-        </w:sectPr>
-      </w:pPr>
-    </w:p>
-    <w:p>
-      <w:pPr>
-        <w:pStyle w:val="BodyText"/>
-        <w:rPr>
-          <w:rFonts w:ascii="Calibri Light"/>
-          <w:sz w:val="15"/>
-        </w:rPr>
-      </w:pPr>
-    </w:p>
-    <w:p>
-      <w:pPr>
-        <w:pStyle w:val="BodyText"/>
-        <w:spacing w:after="0"/>
-        <w:rPr>
-          <w:rFonts w:ascii="Calibri Light"/>
-          <w:sz w:val="15"/>
-        </w:rPr>
-        <w:sectPr>
-          <w:pgSz w:w="11910" w:h="16840"/>
-          <w:pgMar w:header="1039" w:footer="1401" w:top="2080" w:bottom="1600" w:left="708" w:right="708"/>
-        </w:sectPr>
-      </w:pPr>
-    </w:p>
-    <w:p>
-      <w:pPr>
-        <w:pStyle w:val="BodyText"/>
-        <w:spacing w:before="136"/>
-        <w:rPr>
-          <w:rFonts w:ascii="Calibri Light"/>
-          <w:sz w:val="20"/>
-        </w:rPr>
-      </w:pPr>
-    </w:p>
-    <w:p>
-      <w:pPr>
-        <w:pStyle w:val="BodyText"/>
-        <w:ind w:left="3400" w:right="-15"/>
-        <w:rPr>
-          <w:rFonts w:ascii="Calibri Light"/>
-          <w:sz w:val="20"/>
-        </w:rPr>
-      </w:pPr>
-      <w:r>
-        <w:rPr>
-          <w:rFonts w:ascii="Calibri Light"/>
-          <w:sz w:val="20"/>
-        </w:rPr>
-        <w:drawing>
-          <wp:inline distT="0" distB="0" distL="0" distR="0">
-            <wp:extent cx="2313263" cy="5242560"/>
-            <wp:effectExtent l="0" t="0" r="0" b="0"/>
-            <wp:docPr id="8" name="Image 8"/>
-            <wp:cNvGraphicFramePr>
-              <a:graphicFrameLocks/>
-            </wp:cNvGraphicFramePr>
-            <a:graphic>
-              <a:graphicData uri="http://schemas.openxmlformats.org/drawingml/2006/picture">
-                <pic:pic>
-                  <pic:nvPicPr>
-                    <pic:cNvPr id="8" name="Image 8"/>
-                    <pic:cNvPicPr/>
-                  </pic:nvPicPr>
-                  <pic:blipFill>
-                    <a:blip r:embed="rId8" cstate="print"/>
-                    <a:stretch>
-                      <a:fillRect/>
-                    </a:stretch>
-                  </pic:blipFill>
-                  <pic:spPr>
-                    <a:xfrm>
-                      <a:off x="0" y="0"/>
-                      <a:ext cx="2313263" cy="5242560"/>
+                      <a:ext cx="2792543" cy="5432303"/>
                     </a:xfrm>
                     <a:prstGeom prst="rect">
                       <a:avLst/>
@@ -648,228 +477,121 @@
           </wp:inline>
         </w:drawing>
       </w:r>
-      <w:r>
-        <w:rPr>
-          <w:rFonts w:ascii="Calibri Light"/>
-          <w:sz w:val="20"/>
-        </w:rPr>
-      </w:r>
     </w:p>
     <w:p>
       <w:pPr>
-        <w:spacing w:before="270"/>
-        <w:ind w:left="3874" w:right="0" w:firstLine="0"/>
-        <w:jc w:val="left"/>
-        <w:rPr>
-          <w:rFonts w:ascii="Calibri Light" w:hAnsi="Calibri Light"/>
-          <w:sz w:val="32"/>
-        </w:rPr>
+        <w:pStyle w:val="Heading1"/>
+        <w:spacing w:before="128"/>
+        <w:ind w:right="1"/>
+        <w:jc w:val="center"/>
       </w:pPr>
       <w:r>
         <w:rPr>
-          <w:rFonts w:ascii="Calibri Light" w:hAnsi="Calibri Light"/>
           <w:color w:val="2E5395"/>
-          <w:sz w:val="32"/>
-        </w:rPr>
-        <w:t>Now</w:t>
-      </w:r>
-      <w:r>
-        <w:rPr>
-          <w:rFonts w:ascii="Calibri Light" w:hAnsi="Calibri Light"/>
+        </w:rPr>
+        <w:t>Home</w:t>
+      </w:r>
+      <w:r>
+        <w:rPr>
           <w:color w:val="2E5395"/>
-          <w:spacing w:val="-9"/>
-          <w:sz w:val="32"/>
-        </w:rPr>
-        <w:t> </w:t>
-      </w:r>
-      <w:r>
-        <w:rPr>
-          <w:rFonts w:ascii="Calibri Light" w:hAnsi="Calibri Light"/>
-          <w:color w:val="2E5395"/>
-          <w:sz w:val="32"/>
-        </w:rPr>
-        <w:t>Playing</w:t>
-      </w:r>
-      <w:r>
-        <w:rPr>
-          <w:rFonts w:ascii="Calibri Light" w:hAnsi="Calibri Light"/>
-          <w:color w:val="2E5395"/>
-          <w:spacing w:val="-8"/>
-          <w:sz w:val="32"/>
-        </w:rPr>
-        <w:t> </w:t>
-      </w:r>
-      <w:r>
-        <w:rPr>
-          <w:rFonts w:ascii="Calibri Light" w:hAnsi="Calibri Light"/>
-          <w:color w:val="2E5395"/>
-          <w:sz w:val="32"/>
-        </w:rPr>
-        <w:t>–</w:t>
-      </w:r>
-      <w:r>
-        <w:rPr>
-          <w:rFonts w:ascii="Calibri Light" w:hAnsi="Calibri Light"/>
-          <w:color w:val="2E5395"/>
-          <w:spacing w:val="-7"/>
-          <w:sz w:val="32"/>
-        </w:rPr>
-        <w:t> </w:t>
-      </w:r>
-      <w:r>
-        <w:rPr>
-          <w:rFonts w:ascii="Calibri Light" w:hAnsi="Calibri Light"/>
+          <w:spacing w:val="-11"/>
+        </w:rPr>
+        <w:t xml:space="preserve"> </w:t>
+      </w:r>
+      <w:r>
+        <w:rPr>
           <w:color w:val="2E5395"/>
           <w:spacing w:val="-2"/>
-          <w:sz w:val="32"/>
         </w:rPr>
         <w:t>Screen</w:t>
       </w:r>
     </w:p>
     <w:p>
       <w:pPr>
-        <w:tabs>
-          <w:tab w:pos="2390" w:val="left" w:leader="none"/>
-        </w:tabs>
-        <w:spacing w:before="100"/>
-        <w:ind w:left="1603" w:right="0" w:firstLine="0"/>
-        <w:jc w:val="left"/>
-        <w:rPr>
-          <w:b/>
-          <w:sz w:val="24"/>
-        </w:rPr>
-      </w:pPr>
-      <w:r>
-        <w:rPr/>
-        <w:br w:type="column"/>
-      </w:r>
-      <w:r>
-        <w:rPr>
-          <w:b/>
-          <w:spacing w:val="-4"/>
-          <w:sz w:val="24"/>
-        </w:rPr>
-        <w:t>Date:</w:t>
-      </w:r>
-      <w:r>
-        <w:rPr>
-          <w:b/>
-          <w:sz w:val="24"/>
-        </w:rPr>
-        <w:tab/>
-        <w:t>/</w:t>
-      </w:r>
-      <w:r>
-        <w:rPr>
-          <w:b/>
-          <w:spacing w:val="51"/>
-          <w:sz w:val="24"/>
-        </w:rPr>
-        <w:t> </w:t>
-      </w:r>
-      <w:r>
-        <w:rPr>
-          <w:b/>
-          <w:sz w:val="24"/>
-        </w:rPr>
-        <w:t>/</w:t>
-      </w:r>
-      <w:r>
-        <w:rPr>
-          <w:b/>
-          <w:spacing w:val="1"/>
-          <w:sz w:val="24"/>
-        </w:rPr>
-        <w:t> </w:t>
-      </w:r>
-      <w:r>
-        <w:rPr>
-          <w:b/>
-          <w:spacing w:val="-4"/>
-          <w:sz w:val="24"/>
-        </w:rPr>
-        <w:t>2025</w:t>
-      </w:r>
-    </w:p>
-    <w:p>
-      <w:pPr>
-        <w:spacing w:after="0"/>
-        <w:jc w:val="left"/>
-        <w:rPr>
-          <w:b/>
-          <w:sz w:val="24"/>
-        </w:rPr>
+        <w:pStyle w:val="Heading1"/>
+        <w:jc w:val="center"/>
         <w:sectPr>
+          <w:headerReference w:type="default" r:id="rId7"/>
+          <w:footerReference w:type="default" r:id="rId8"/>
           <w:type w:val="continuous"/>
           <w:pgSz w:w="11910" w:h="16840"/>
-          <w:pgMar w:header="1039" w:footer="1401" w:top="2080" w:bottom="1600" w:left="708" w:right="708"/>
-          <w:cols w:num="2" w:equalWidth="0">
-            <w:col w:w="7080" w:space="40"/>
-            <w:col w:w="3374"/>
-          </w:cols>
+          <w:pgMar w:top="2080" w:right="708" w:bottom="1600" w:left="708" w:header="1039" w:footer="1401" w:gutter="0"/>
+          <w:pgNumType w:start="1"/>
+          <w:cols w:space="720"/>
         </w:sectPr>
       </w:pPr>
     </w:p>
     <w:p>
       <w:pPr>
-        <w:spacing w:line="240" w:lineRule="auto" w:before="7"/>
-        <w:rPr>
-          <w:b/>
+        <w:pStyle w:val="BodyText"/>
+        <w:rPr>
+          <w:rFonts w:ascii="Calibri Light"/>
           <w:sz w:val="15"/>
         </w:rPr>
       </w:pPr>
     </w:p>
     <w:p>
       <w:pPr>
-        <w:spacing w:after="0" w:line="240" w:lineRule="auto"/>
-        <w:rPr>
-          <w:b/>
+        <w:pStyle w:val="BodyText"/>
+        <w:rPr>
+          <w:rFonts w:ascii="Calibri Light"/>
           <w:sz w:val="15"/>
         </w:rPr>
         <w:sectPr>
           <w:pgSz w:w="11910" w:h="16840"/>
-          <w:pgMar w:header="1039" w:footer="1401" w:top="2080" w:bottom="1600" w:left="708" w:right="708"/>
+          <w:pgMar w:top="2080" w:right="708" w:bottom="1600" w:left="708" w:header="1039" w:footer="1401" w:gutter="0"/>
+          <w:cols w:space="720"/>
         </w:sectPr>
       </w:pPr>
     </w:p>
     <w:p>
       <w:pPr>
-        <w:spacing w:line="240" w:lineRule="auto" w:before="146" w:after="0"/>
-        <w:rPr>
-          <w:b/>
+        <w:pStyle w:val="BodyText"/>
+        <w:spacing w:before="136"/>
+        <w:rPr>
+          <w:rFonts w:ascii="Calibri Light"/>
           <w:sz w:val="20"/>
         </w:rPr>
       </w:pPr>
     </w:p>
     <w:p>
       <w:pPr>
-        <w:spacing w:line="240" w:lineRule="auto"/>
-        <w:ind w:left="3400" w:right="-87" w:firstLine="0"/>
-        <w:rPr>
+        <w:pStyle w:val="BodyText"/>
+        <w:ind w:left="3400" w:right="-15"/>
+        <w:rPr>
+          <w:rFonts w:ascii="Calibri Light"/>
           <w:sz w:val="20"/>
         </w:rPr>
       </w:pPr>
       <w:r>
         <w:rPr>
+          <w:rFonts w:ascii="Calibri Light"/>
+          <w:noProof/>
           <w:sz w:val="20"/>
         </w:rPr>
         <w:drawing>
-          <wp:inline distT="0" distB="0" distL="0" distR="0">
-            <wp:extent cx="2357852" cy="5343525"/>
+          <wp:inline distT="0" distB="0" distL="0" distR="0" wp14:anchorId="68B59A4E" wp14:editId="73382F8D">
+            <wp:extent cx="2313263" cy="4554461"/>
             <wp:effectExtent l="0" t="0" r="0" b="0"/>
-            <wp:docPr id="9" name="Image 9"/>
+            <wp:docPr id="8" name="Image 8"/>
             <wp:cNvGraphicFramePr>
-              <a:graphicFrameLocks/>
+              <a:graphicFrameLocks xmlns:a="http://schemas.openxmlformats.org/drawingml/2006/main"/>
             </wp:cNvGraphicFramePr>
-            <a:graphic>
+            <a:graphic xmlns:a="http://schemas.openxmlformats.org/drawingml/2006/main">
               <a:graphicData uri="http://schemas.openxmlformats.org/drawingml/2006/picture">
-                <pic:pic>
+                <pic:pic xmlns:pic="http://schemas.openxmlformats.org/drawingml/2006/picture">
                   <pic:nvPicPr>
-                    <pic:cNvPr id="9" name="Image 9"/>
+                    <pic:cNvPr id="8" name="Image 8"/>
                     <pic:cNvPicPr/>
                   </pic:nvPicPr>
                   <pic:blipFill>
-                    <a:blip r:embed="rId9" cstate="print"/>
+                    <a:blip r:embed="rId9" cstate="print">
+                      <a:extLst>
+                        <a:ext uri="{28A0092B-C50C-407E-A947-70E740481C1C}">
+                          <a14:useLocalDpi xmlns:a14="http://schemas.microsoft.com/office/drawing/2010/main" val="0"/>
+                        </a:ext>
+                      </a:extLst>
+                    </a:blip>
                     <a:stretch>
                       <a:fillRect/>
                     </a:stretch>
@@ -877,7 +599,7 @@
                   <pic:spPr>
                     <a:xfrm>
                       <a:off x="0" y="0"/>
-                      <a:ext cx="2357852" cy="5343525"/>
+                      <a:ext cx="2313263" cy="4554461"/>
                     </a:xfrm>
                     <a:prstGeom prst="rect">
                       <a:avLst/>
@@ -889,10 +611,223 @@
           </wp:inline>
         </w:drawing>
       </w:r>
-      <w:r>
-        <w:rPr>
+    </w:p>
+    <w:p>
+      <w:pPr>
+        <w:spacing w:before="270"/>
+        <w:ind w:left="3874"/>
+        <w:rPr>
+          <w:rFonts w:ascii="Calibri Light" w:hAnsi="Calibri Light"/>
+          <w:sz w:val="32"/>
+        </w:rPr>
+      </w:pPr>
+      <w:r>
+        <w:rPr>
+          <w:rFonts w:ascii="Calibri Light" w:hAnsi="Calibri Light"/>
+          <w:color w:val="2E5395"/>
+          <w:sz w:val="32"/>
+        </w:rPr>
+        <w:t>Now</w:t>
+      </w:r>
+      <w:r>
+        <w:rPr>
+          <w:rFonts w:ascii="Calibri Light" w:hAnsi="Calibri Light"/>
+          <w:color w:val="2E5395"/>
+          <w:spacing w:val="-9"/>
+          <w:sz w:val="32"/>
+        </w:rPr>
+        <w:t xml:space="preserve"> </w:t>
+      </w:r>
+      <w:r>
+        <w:rPr>
+          <w:rFonts w:ascii="Calibri Light" w:hAnsi="Calibri Light"/>
+          <w:color w:val="2E5395"/>
+          <w:sz w:val="32"/>
+        </w:rPr>
+        <w:t>Playing</w:t>
+      </w:r>
+      <w:r>
+        <w:rPr>
+          <w:rFonts w:ascii="Calibri Light" w:hAnsi="Calibri Light"/>
+          <w:color w:val="2E5395"/>
+          <w:spacing w:val="-8"/>
+          <w:sz w:val="32"/>
+        </w:rPr>
+        <w:t xml:space="preserve"> </w:t>
+      </w:r>
+      <w:r>
+        <w:rPr>
+          <w:rFonts w:ascii="Calibri Light" w:hAnsi="Calibri Light"/>
+          <w:color w:val="2E5395"/>
+          <w:sz w:val="32"/>
+        </w:rPr>
+        <w:t>–</w:t>
+      </w:r>
+      <w:r>
+        <w:rPr>
+          <w:rFonts w:ascii="Calibri Light" w:hAnsi="Calibri Light"/>
+          <w:color w:val="2E5395"/>
+          <w:spacing w:val="-7"/>
+          <w:sz w:val="32"/>
+        </w:rPr>
+        <w:t xml:space="preserve"> </w:t>
+      </w:r>
+      <w:r>
+        <w:rPr>
+          <w:rFonts w:ascii="Calibri Light" w:hAnsi="Calibri Light"/>
+          <w:color w:val="2E5395"/>
+          <w:spacing w:val="-2"/>
+          <w:sz w:val="32"/>
+        </w:rPr>
+        <w:t>Screen</w:t>
+      </w:r>
+    </w:p>
+    <w:p>
+      <w:pPr>
+        <w:pStyle w:val="Heading2"/>
+        <w:tabs>
+          <w:tab w:val="left" w:pos="787"/>
+        </w:tabs>
+        <w:jc w:val="right"/>
+      </w:pPr>
+      <w:r>
+        <w:br w:type="column"/>
+      </w:r>
+      <w:r>
+        <w:rPr>
+          <w:spacing w:val="-4"/>
+        </w:rPr>
+        <w:t>Date:</w:t>
+      </w:r>
+      <w:r>
+        <w:tab/>
+        <w:t>0</w:t>
+      </w:r>
+      <w:r>
+        <w:t>9</w:t>
+      </w:r>
+      <w:r>
+        <w:t>/</w:t>
+      </w:r>
+      <w:r>
+        <w:rPr>
+          <w:spacing w:val="53"/>
+        </w:rPr>
+        <w:t>12</w:t>
+      </w:r>
+      <w:r>
+        <w:rPr>
+          <w:spacing w:val="-4"/>
+        </w:rPr>
+        <w:t>/2025</w:t>
+      </w:r>
+    </w:p>
+    <w:p>
+      <w:pPr>
+        <w:tabs>
+          <w:tab w:val="left" w:pos="2390"/>
+        </w:tabs>
+        <w:spacing w:before="100"/>
+        <w:ind w:left="1603"/>
+        <w:rPr>
+          <w:b/>
+          <w:sz w:val="24"/>
+        </w:rPr>
+        <w:sectPr>
+          <w:type w:val="continuous"/>
+          <w:pgSz w:w="11910" w:h="16840"/>
+          <w:pgMar w:top="2080" w:right="708" w:bottom="1600" w:left="708" w:header="1039" w:footer="1401" w:gutter="0"/>
+          <w:cols w:num="2" w:space="720" w:equalWidth="0">
+            <w:col w:w="7080" w:space="40"/>
+            <w:col w:w="3374"/>
+          </w:cols>
+        </w:sectPr>
+      </w:pPr>
+    </w:p>
+    <w:p>
+      <w:pPr>
+        <w:spacing w:before="7"/>
+        <w:rPr>
+          <w:b/>
+          <w:sz w:val="15"/>
+        </w:rPr>
+      </w:pPr>
+    </w:p>
+    <w:p>
+      <w:pPr>
+        <w:rPr>
+          <w:b/>
+          <w:sz w:val="15"/>
+        </w:rPr>
+        <w:sectPr>
+          <w:pgSz w:w="11910" w:h="16840"/>
+          <w:pgMar w:top="2080" w:right="708" w:bottom="1600" w:left="708" w:header="1039" w:footer="1401" w:gutter="0"/>
+          <w:cols w:space="720"/>
+        </w:sectPr>
+      </w:pPr>
+    </w:p>
+    <w:p>
+      <w:pPr>
+        <w:spacing w:before="146"/>
+        <w:rPr>
+          <w:b/>
           <w:sz w:val="20"/>
         </w:rPr>
+      </w:pPr>
+    </w:p>
+    <w:p>
+      <w:pPr>
+        <w:ind w:left="3400" w:right="-87"/>
+        <w:rPr>
+          <w:sz w:val="20"/>
+        </w:rPr>
+      </w:pPr>
+      <w:r>
+        <w:rPr>
+          <w:noProof/>
+          <w:sz w:val="20"/>
+        </w:rPr>
+        <w:drawing>
+          <wp:inline distT="0" distB="0" distL="0" distR="0" wp14:anchorId="47F80E0D" wp14:editId="0762C550">
+            <wp:extent cx="2357852" cy="4642250"/>
+            <wp:effectExtent l="0" t="0" r="4445" b="6350"/>
+            <wp:docPr id="9" name="Image 9"/>
+            <wp:cNvGraphicFramePr>
+              <a:graphicFrameLocks xmlns:a="http://schemas.openxmlformats.org/drawingml/2006/main"/>
+            </wp:cNvGraphicFramePr>
+            <a:graphic xmlns:a="http://schemas.openxmlformats.org/drawingml/2006/main">
+              <a:graphicData uri="http://schemas.openxmlformats.org/drawingml/2006/picture">
+                <pic:pic xmlns:pic="http://schemas.openxmlformats.org/drawingml/2006/picture">
+                  <pic:nvPicPr>
+                    <pic:cNvPr id="9" name="Image 9"/>
+                    <pic:cNvPicPr/>
+                  </pic:nvPicPr>
+                  <pic:blipFill>
+                    <a:blip r:embed="rId10" cstate="print">
+                      <a:extLst>
+                        <a:ext uri="{28A0092B-C50C-407E-A947-70E740481C1C}">
+                          <a14:useLocalDpi xmlns:a14="http://schemas.microsoft.com/office/drawing/2010/main" val="0"/>
+                        </a:ext>
+                      </a:extLst>
+                    </a:blip>
+                    <a:stretch>
+                      <a:fillRect/>
+                    </a:stretch>
+                  </pic:blipFill>
+                  <pic:spPr>
+                    <a:xfrm>
+                      <a:off x="0" y="0"/>
+                      <a:ext cx="2357852" cy="4642250"/>
+                    </a:xfrm>
+                    <a:prstGeom prst="rect">
+                      <a:avLst/>
+                    </a:prstGeom>
+                  </pic:spPr>
+                </pic:pic>
+              </a:graphicData>
+            </a:graphic>
+          </wp:inline>
+        </w:drawing>
       </w:r>
     </w:p>
     <w:p>
@@ -904,86 +839,86 @@
         <w:rPr>
           <w:color w:val="2E5395"/>
         </w:rPr>
-        <w:t>Library-</w:t>
+        <w:t>Li</w:t>
+      </w:r>
+      <w:r>
+        <w:rPr>
+          <w:color w:val="2E5395"/>
+        </w:rPr>
+        <w:t>st</w:t>
+      </w:r>
+      <w:r>
+        <w:rPr>
+          <w:color w:val="2E5395"/>
+        </w:rPr>
+        <w:t>-</w:t>
       </w:r>
       <w:r>
         <w:rPr>
           <w:color w:val="2E5395"/>
           <w:spacing w:val="-2"/>
         </w:rPr>
-        <w:t> Screen</w:t>
+        <w:t xml:space="preserve"> Screen</w:t>
+      </w:r>
+    </w:p>
+    <w:p>
+      <w:pPr>
+        <w:pStyle w:val="Heading2"/>
+        <w:tabs>
+          <w:tab w:val="left" w:pos="787"/>
+        </w:tabs>
+        <w:jc w:val="right"/>
+      </w:pPr>
+      <w:r>
+        <w:br w:type="column"/>
+      </w:r>
+      <w:r>
+        <w:rPr>
+          <w:spacing w:val="-4"/>
+        </w:rPr>
+        <w:t>Date:</w:t>
+      </w:r>
+      <w:r>
+        <w:tab/>
+        <w:t>0</w:t>
+      </w:r>
+      <w:r>
+        <w:t>9</w:t>
+      </w:r>
+      <w:r>
+        <w:t>/</w:t>
+      </w:r>
+      <w:r>
+        <w:rPr>
+          <w:spacing w:val="53"/>
+        </w:rPr>
+        <w:t>12</w:t>
+      </w:r>
+      <w:r>
+        <w:rPr>
+          <w:spacing w:val="-4"/>
+        </w:rPr>
+        <w:t>/2025</w:t>
       </w:r>
     </w:p>
     <w:p>
       <w:pPr>
         <w:tabs>
-          <w:tab w:pos="2391" w:val="left" w:leader="none"/>
+          <w:tab w:val="left" w:pos="2391"/>
         </w:tabs>
         <w:spacing w:before="100"/>
-        <w:ind w:left="1604" w:right="0" w:firstLine="0"/>
-        <w:jc w:val="left"/>
+        <w:ind w:left="1604"/>
         <w:rPr>
           <w:b/>
           <w:sz w:val="24"/>
         </w:rPr>
       </w:pPr>
-      <w:r>
-        <w:rPr/>
-        <w:br w:type="column"/>
-      </w:r>
-      <w:r>
-        <w:rPr>
-          <w:b/>
-          <w:spacing w:val="-4"/>
-          <w:sz w:val="24"/>
-        </w:rPr>
-        <w:t>Date:</w:t>
-      </w:r>
-      <w:r>
-        <w:rPr>
-          <w:b/>
-          <w:sz w:val="24"/>
-        </w:rPr>
-        <w:tab/>
-        <w:t>/</w:t>
-      </w:r>
-      <w:r>
-        <w:rPr>
-          <w:b/>
-          <w:spacing w:val="51"/>
-          <w:sz w:val="24"/>
-        </w:rPr>
-        <w:t> </w:t>
-      </w:r>
-      <w:r>
-        <w:rPr>
-          <w:b/>
-          <w:sz w:val="24"/>
-        </w:rPr>
-        <w:t>/</w:t>
-      </w:r>
-      <w:r>
-        <w:rPr>
-          <w:b/>
-          <w:spacing w:val="1"/>
-          <w:sz w:val="24"/>
-        </w:rPr>
-        <w:t> </w:t>
-      </w:r>
-      <w:r>
-        <w:rPr>
-          <w:b/>
-          <w:spacing w:val="-4"/>
-          <w:sz w:val="24"/>
-        </w:rPr>
-        <w:t>2025</w:t>
-      </w:r>
     </w:p>
     <w:sectPr>
       <w:type w:val="continuous"/>
       <w:pgSz w:w="11910" w:h="16840"/>
-      <w:pgMar w:header="1039" w:footer="1401" w:top="2080" w:bottom="1600" w:left="708" w:right="708"/>
-      <w:cols w:num="2" w:equalWidth="0">
+      <w:pgMar w:top="2080" w:right="708" w:bottom="1600" w:left="708" w:header="1039" w:footer="1401" w:gutter="0"/>
+      <w:cols w:num="2" w:space="720" w:equalWidth="0">
         <w:col w:w="7080" w:space="40"/>
         <w:col w:w="3374"/>
       </w:cols>
@@ -992,8 +927,27 @@
 </w:document>
 </file>
 
+<file path=word/endnotes.xml><?xml version="1.0" encoding="utf-8"?>
+<w:endnotes xmlns:wpc="http://schemas.microsoft.com/office/word/2010/wordprocessingCanvas" xmlns:cx="http://schemas.microsoft.com/office/drawing/2014/chartex" xmlns:cx1="http://schemas.microsoft.com/office/drawing/2015/9/8/chartex" xmlns:cx2="http://schemas.microsoft.com/office/drawing/2015/10/21/chartex" xmlns:cx3="http://schemas.microsoft.com/office/drawing/2016/5/9/chartex" xmlns:cx4="http://schemas.microsoft.com/office/drawing/2016/5/10/chartex" xmlns:cx5="http://schemas.microsoft.com/office/drawing/2016/5/11/chartex" xmlns:cx6="http://schemas.microsoft.com/office/drawing/2016/5/12/chartex" xmlns:cx7="http://schemas.microsoft.com/office/drawing/2016/5/13/chartex" xmlns:cx8="http://schemas.microsoft.com/office/drawing/2016/5/14/chartex" xmlns:mc="http://schemas.openxmlformats.org/markup-compatibility/2006" xmlns:aink="http://schemas.microsoft.com/office/drawing/2016/ink" xmlns:am3d="http://schemas.microsoft.com/office/drawing/2017/model3d" xmlns:o="urn:schemas-microsoft-com:office:office" xmlns:oel="http://schemas.microsoft.com/office/2019/extlst" xmlns:r="http://schemas.openxmlformats.org/officeDocument/2006/relationships" xmlns:m="http://schemas.openxmlformats.org/officeDocument/2006/math" xmlns:v="urn:schemas-microsoft-com:vml" xmlns:wp14="http://schemas.microsoft.com/office/word/2010/wordprocessingDrawing" xmlns:wp="http://schemas.openxmlformats.org/drawingml/2006/wordprocessingDrawing" xmlns:w10="urn:schemas-microsoft-com:office:word" xmlns:w="http://schemas.openxmlformats.org/wordprocessingml/2006/main" xmlns:w14="http://schemas.microsoft.com/office/word/2010/wordml" xmlns:w15="http://schemas.microsoft.com/office/word/2012/wordml" xmlns:w16cex="http://schemas.microsoft.com/office/word/2018/wordml/cex" xmlns:w16cid="http://schemas.microsoft.com/office/word/2016/wordml/cid" xmlns:w16="http://schemas.microsoft.com/office/word/2018/wordml" xmlns:w16du="http://schemas.microsoft.com/office/word/2023/wordml/word16du" xmlns:w16sdtdh="http://schemas.microsoft.com/office/word/2020/wordml/sdtdatahash" xmlns:w16sdtfl="http://schemas.microsoft.com/office/word/2024/wordml/sdtformatlock" xmlns:w16se="http://schemas.microsoft.com/office/word/2015/wordml/symex" xmlns:wpg="http://schemas.microsoft.com/office/word/2010/wordprocessingGroup" xmlns:wpi="http://schemas.microsoft.com/office/word/2010/wordprocessingInk" xmlns:wne="http://schemas.microsoft.com/office/word/2006/wordml" xmlns:wps="http://schemas.microsoft.com/office/word/2010/wordprocessingShape" mc:Ignorable="w14 w15 w16se w16cid w16 w16cex w16sdtdh w16sdtfl w16du wp14">
+  <w:endnote w:type="separator" w:id="-1">
+    <w:p>
+      <w:r>
+        <w:separator/>
+      </w:r>
+    </w:p>
+  </w:endnote>
+  <w:endnote w:type="continuationSeparator" w:id="0">
+    <w:p>
+      <w:r>
+        <w:continuationSeparator/>
+      </w:r>
+    </w:p>
+  </w:endnote>
+</w:endnotes>
+</file>
+
 <file path=word/footer1.xml><?xml version="1.0" encoding="utf-8"?>
-<w:ftr xmlns:mc="http://schemas.openxmlformats.org/markup-compatibility/2006" xmlns:ve="http://schemas.openxmlformats.org/markup-compatibility/2006" xmlns:o="urn:schemas-microsoft-com:office:office" xmlns:r="http://schemas.openxmlformats.org/officeDocument/2006/relationships" xmlns:m="http://schemas.openxmlformats.org/officeDocument/2006/math" xmlns:v="urn:schemas-microsoft-com:vml" xmlns:wp="http://schemas.openxmlformats.org/drawingml/2006/wordprocessingDrawing" xmlns:w10="urn:schemas-microsoft-com:office:word" xmlns:w="http://schemas.openxmlformats.org/wordprocessingml/2006/main" xmlns:wne="http://schemas.microsoft.com/office/word/2006/wordml" xmlns:a="http://schemas.openxmlformats.org/drawingml/2006/main" xmlns:pic="http://schemas.openxmlformats.org/drawingml/2006/picture" xmlns:wpg="http://schemas.microsoft.com/office/word/2010/wordprocessingGroup" xmlns:wps="http://schemas.microsoft.com/office/word/2010/wordprocessingShape" xmlns:w14="http://schemas.microsoft.com/office/word/2010/wordml" mc:Ignorable="w14" xml:space="preserve">
+<w:ftr xmlns:wpc="http://schemas.microsoft.com/office/word/2010/wordprocessingCanvas" xmlns:cx="http://schemas.microsoft.com/office/drawing/2014/chartex" xmlns:cx1="http://schemas.microsoft.com/office/drawing/2015/9/8/chartex" xmlns:cx2="http://schemas.microsoft.com/office/drawing/2015/10/21/chartex" xmlns:cx3="http://schemas.microsoft.com/office/drawing/2016/5/9/chartex" xmlns:cx4="http://schemas.microsoft.com/office/drawing/2016/5/10/chartex" xmlns:cx5="http://schemas.microsoft.com/office/drawing/2016/5/11/chartex" xmlns:cx6="http://schemas.microsoft.com/office/drawing/2016/5/12/chartex" xmlns:cx7="http://schemas.microsoft.com/office/drawing/2016/5/13/chartex" xmlns:cx8="http://schemas.microsoft.com/office/drawing/2016/5/14/chartex" xmlns:mc="http://schemas.openxmlformats.org/markup-compatibility/2006" xmlns:aink="http://schemas.microsoft.com/office/drawing/2016/ink" xmlns:am3d="http://schemas.microsoft.com/office/drawing/2017/model3d" xmlns:o="urn:schemas-microsoft-com:office:office" xmlns:oel="http://schemas.microsoft.com/office/2019/extlst" xmlns:r="http://schemas.openxmlformats.org/officeDocument/2006/relationships" xmlns:m="http://schemas.openxmlformats.org/officeDocument/2006/math" xmlns:v="urn:schemas-microsoft-com:vml" xmlns:wp14="http://schemas.microsoft.com/office/word/2010/wordprocessingDrawing" xmlns:wp="http://schemas.openxmlformats.org/drawingml/2006/wordprocessingDrawing" xmlns:w10="urn:schemas-microsoft-com:office:word" xmlns:w="http://schemas.openxmlformats.org/wordprocessingml/2006/main" xmlns:w14="http://schemas.microsoft.com/office/word/2010/wordml" xmlns:w15="http://schemas.microsoft.com/office/word/2012/wordml" xmlns:w16cex="http://schemas.microsoft.com/office/word/2018/wordml/cex" xmlns:w16cid="http://schemas.microsoft.com/office/word/2016/wordml/cid" xmlns:w16="http://schemas.microsoft.com/office/word/2018/wordml" xmlns:w16du="http://schemas.microsoft.com/office/word/2023/wordml/word16du" xmlns:w16sdtdh="http://schemas.microsoft.com/office/word/2020/wordml/sdtdatahash" xmlns:w16sdtfl="http://schemas.microsoft.com/office/word/2024/wordml/sdtformatlock" xmlns:w16se="http://schemas.microsoft.com/office/word/2015/wordml/symex" xmlns:wpg="http://schemas.microsoft.com/office/word/2010/wordprocessingGroup" xmlns:wpi="http://schemas.microsoft.com/office/word/2010/wordprocessingInk" xmlns:wne="http://schemas.microsoft.com/office/word/2006/wordml" xmlns:wps="http://schemas.microsoft.com/office/word/2010/wordprocessingShape" mc:Ignorable="w14 w15 w16se w16cid w16 w16cex w16sdtdh w16sdtfl w16du wp14">
   <w:p>
     <w:pPr>
       <w:pStyle w:val="BodyText"/>
@@ -1004,12 +958,13 @@
     </w:pPr>
     <w:r>
       <w:rPr>
+        <w:noProof/>
         <w:sz w:val="20"/>
       </w:rPr>
       <mc:AlternateContent>
         <mc:Choice Requires="wps">
           <w:drawing>
-            <wp:anchor distT="0" distB="0" distL="0" distR="0" allowOverlap="1" layoutInCell="1" locked="0" behindDoc="1" simplePos="0" relativeHeight="487546880">
+            <wp:anchor distT="0" distB="0" distL="0" distR="0" simplePos="0" relativeHeight="487546880" behindDoc="1" locked="0" layoutInCell="1" allowOverlap="1" wp14:anchorId="4649914E" wp14:editId="0F584856">
               <wp:simplePos x="0" y="0"/>
               <wp:positionH relativeFrom="page">
                 <wp:posOffset>457200</wp:posOffset>
@@ -1022,13 +977,14 @@
               <wp:wrapNone/>
               <wp:docPr id="4" name="Graphic 4"/>
               <wp:cNvGraphicFramePr>
-                <a:graphicFrameLocks/>
+                <a:graphicFrameLocks xmlns:a="http://schemas.openxmlformats.org/drawingml/2006/main"/>
               </wp:cNvGraphicFramePr>
-              <a:graphic>
+              <a:graphic xmlns:a="http://schemas.openxmlformats.org/drawingml/2006/main">
                 <a:graphicData uri="http://schemas.microsoft.com/office/word/2010/wordprocessingShape">
                   <wps:wsp>
-                    <wps:cNvPr id="4" name="Graphic 4"/>
-                    <wps:cNvSpPr/>
+                    <wps:cNvSpPr>
+                      <a:spLocks/>
+                    </wps:cNvSpPr>
                     <wps:spPr>
                       <a:xfrm>
                         <a:off x="0" y="0"/>
@@ -1175,10 +1131,9 @@
         </mc:Choice>
         <mc:Fallback>
           <w:pict>
-            <v:shape style="position:absolute;margin-left:36pt;margin-top:761.855957pt;width:522.9500pt;height:17.9pt;mso-position-horizontal-relative:page;mso-position-vertical-relative:page;z-index:-15769600" id="docshape3" coordorigin="720,15237" coordsize="10459,358" path="m1728,15268l1700,15268,1700,15595,1728,15595,1728,15268xm1728,15237l1700,15237,720,15237,720,15266,1700,15266,1700,15268,1728,15268,1728,15266,1728,15237xm9355,15237l1728,15237,1728,15266,9355,15266,9355,15237xm9384,15268l9355,15268,9355,15595,9384,15595,9384,15268xm11179,15237l9384,15237,9355,15237,9355,15266,9355,15268,9384,15268,9384,15266,11179,15266,11179,15237xe" filled="true" fillcolor="#000000" stroked="false">
+            <v:shape w14:anchorId="7914AB9F" id="Graphic 4" o:spid="_x0000_s1026" style="position:absolute;margin-left:36pt;margin-top:761.85pt;width:522.95pt;height:17.9pt;z-index:-15769600;visibility:visible;mso-wrap-style:square;mso-wrap-distance-left:0;mso-wrap-distance-top:0;mso-wrap-distance-right:0;mso-wrap-distance-bottom:0;mso-position-horizontal:absolute;mso-position-horizontal-relative:page;mso-position-vertical:absolute;mso-position-vertical-relative:page;v-text-anchor:top" coordsize="6641465,227329" o:gfxdata="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" path="m640372,19824r-18276,l622096,227076r18276,l640372,19824xem640372,l622096,,,,,18288r622096,l622096,19812r18276,l640372,18288,640372,xem5483022,l640384,r,18288l5483022,18288r,-18288xem5501386,19824r-18288,l5483098,227076r18288,l5501386,19824xem6641338,l5501386,r-18288,l5483098,18288r,1524l5501386,19812r,-1524l6641338,18288r,-18288xe" fillcolor="black" stroked="f">
               <v:path arrowok="t"/>
-              <v:fill type="solid"/>
-              <w10:wrap type="none"/>
+              <w10:wrap anchorx="page" anchory="page"/>
             </v:shape>
           </w:pict>
         </mc:Fallback>
@@ -1186,12 +1141,13 @@
     </w:r>
     <w:r>
       <w:rPr>
+        <w:noProof/>
         <w:sz w:val="20"/>
       </w:rPr>
       <mc:AlternateContent>
         <mc:Choice Requires="wps">
           <w:drawing>
-            <wp:anchor distT="0" distB="0" distL="0" distR="0" allowOverlap="1" layoutInCell="1" locked="0" behindDoc="1" simplePos="0" relativeHeight="487547392">
+            <wp:anchor distT="0" distB="0" distL="0" distR="0" simplePos="0" relativeHeight="487547392" behindDoc="1" locked="0" layoutInCell="1" allowOverlap="1" wp14:anchorId="48DBCD67" wp14:editId="3363D12B">
               <wp:simplePos x="0" y="0"/>
               <wp:positionH relativeFrom="page">
                 <wp:posOffset>876604</wp:posOffset>
@@ -1204,13 +1160,14 @@
               <wp:wrapNone/>
               <wp:docPr id="5" name="Textbox 5"/>
               <wp:cNvGraphicFramePr>
-                <a:graphicFrameLocks/>
+                <a:graphicFrameLocks xmlns:a="http://schemas.openxmlformats.org/drawingml/2006/main"/>
               </wp:cNvGraphicFramePr>
-              <a:graphic>
+              <a:graphic xmlns:a="http://schemas.openxmlformats.org/drawingml/2006/main">
                 <a:graphicData uri="http://schemas.microsoft.com/office/word/2010/wordprocessingShape">
                   <wps:wsp>
-                    <wps:cNvPr id="5" name="Textbox 5"/>
-                    <wps:cNvSpPr txBox="1"/>
+                    <wps:cNvSpPr txBox="1">
+                      <a:spLocks/>
+                    </wps:cNvSpPr>
                     <wps:spPr>
                       <a:xfrm>
                         <a:off x="0" y="0"/>
@@ -1225,11 +1182,10 @@
                         <w:p>
                           <w:pPr>
                             <w:tabs>
-                              <w:tab w:pos="441" w:val="left" w:leader="none"/>
+                              <w:tab w:val="left" w:pos="441"/>
                             </w:tabs>
                             <w:spacing w:before="20"/>
-                            <w:ind w:left="60" w:right="0" w:firstLine="0"/>
-                            <w:jc w:val="left"/>
+                            <w:ind w:left="60"/>
                             <w:rPr>
                               <w:sz w:val="28"/>
                             </w:rPr>
@@ -1248,7 +1204,7 @@
                               <w:spacing w:val="-10"/>
                               <w:sz w:val="28"/>
                             </w:rPr>
-                            <w:instrText> PAGE </w:instrText>
+                            <w:instrText xml:space="preserve"> PAGE </w:instrText>
                           </w:r>
                           <w:r>
                             <w:rPr>
@@ -1292,7 +1248,7 @@
                               <w:spacing w:val="-9"/>
                               <w:sz w:val="28"/>
                             </w:rPr>
-                            <w:t> </w:t>
+                            <w:t xml:space="preserve"> </w:t>
                           </w:r>
                           <w:r>
                             <w:rPr>
@@ -1305,14 +1261,21 @@
                               <w:spacing w:val="-7"/>
                               <w:sz w:val="28"/>
                             </w:rPr>
-                            <w:t> </w:t>
+                            <w:t xml:space="preserve"> </w:t>
                           </w:r>
                           <w:r>
                             <w:rPr>
                               <w:spacing w:val="-2"/>
                               <w:sz w:val="28"/>
                             </w:rPr>
-                            <w:t>22010XXXXXX</w:t>
+                            <w:t>2</w:t>
+                          </w:r>
+                          <w:r>
+                            <w:rPr>
+                              <w:spacing w:val="-2"/>
+                              <w:sz w:val="28"/>
+                            </w:rPr>
+                            <w:t>4010101621</w:t>
                           </w:r>
                         </w:p>
                       </w:txbxContent>
@@ -1328,17 +1291,20 @@
         </mc:Choice>
         <mc:Fallback>
           <w:pict>
-            <v:shape style="position:absolute;margin-left:69.024002pt;margin-top:762.275269pt;width:204.2pt;height:18.5pt;mso-position-horizontal-relative:page;mso-position-vertical-relative:page;z-index:-15769088" type="#_x0000_t202" id="docshape4" filled="false" stroked="false">
+            <v:shapetype w14:anchorId="48DBCD67" id="_x0000_t202" coordsize="21600,21600" o:spt="202" path="m,l,21600r21600,l21600,xe">
+              <v:stroke joinstyle="miter"/>
+              <v:path gradientshapeok="t" o:connecttype="rect"/>
+            </v:shapetype>
+            <v:shape id="Textbox 5" o:spid="_x0000_s1027" type="#_x0000_t202" style="position:absolute;margin-left:69pt;margin-top:762.3pt;width:204.2pt;height:18.5pt;z-index:-15769088;visibility:visible;mso-wrap-style:square;mso-wrap-distance-left:0;mso-wrap-distance-top:0;mso-wrap-distance-right:0;mso-wrap-distance-bottom:0;mso-position-horizontal:absolute;mso-position-horizontal-relative:page;mso-position-vertical:absolute;mso-position-vertical-relative:page;v-text-anchor:top" o:gfxdata="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" filled="f" stroked="f">
               <v:textbox inset="0,0,0,0">
                 <w:txbxContent>
                   <w:p>
                     <w:pPr>
                       <w:tabs>
-                        <w:tab w:pos="441" w:val="left" w:leader="none"/>
+                        <w:tab w:val="left" w:pos="441"/>
                       </w:tabs>
                       <w:spacing w:before="20"/>
-                      <w:ind w:left="60" w:right="0" w:firstLine="0"/>
-                      <w:jc w:val="left"/>
+                      <w:ind w:left="60"/>
                       <w:rPr>
                         <w:sz w:val="28"/>
                       </w:rPr>
@@ -1357,7 +1323,7 @@
                         <w:spacing w:val="-10"/>
                         <w:sz w:val="28"/>
                       </w:rPr>
-                      <w:instrText> PAGE </w:instrText>
+                      <w:instrText xml:space="preserve"> PAGE </w:instrText>
                     </w:r>
                     <w:r>
                       <w:rPr>
@@ -1401,7 +1367,7 @@
                         <w:spacing w:val="-9"/>
                         <w:sz w:val="28"/>
                       </w:rPr>
-                      <w:t> </w:t>
+                      <w:t xml:space="preserve"> </w:t>
                     </w:r>
                     <w:r>
                       <w:rPr>
@@ -1414,19 +1380,26 @@
                         <w:spacing w:val="-7"/>
                         <w:sz w:val="28"/>
                       </w:rPr>
-                      <w:t> </w:t>
+                      <w:t xml:space="preserve"> </w:t>
                     </w:r>
                     <w:r>
                       <w:rPr>
                         <w:spacing w:val="-2"/>
                         <w:sz w:val="28"/>
                       </w:rPr>
-                      <w:t>22010XXXXXX</w:t>
+                      <w:t>2</w:t>
+                    </w:r>
+                    <w:r>
+                      <w:rPr>
+                        <w:spacing w:val="-2"/>
+                        <w:sz w:val="28"/>
+                      </w:rPr>
+                      <w:t>4010101621</w:t>
                     </w:r>
                   </w:p>
                 </w:txbxContent>
               </v:textbox>
-              <w10:wrap type="none"/>
+              <w10:wrap anchorx="page" anchory="page"/>
             </v:shape>
           </w:pict>
         </mc:Fallback>
@@ -1434,12 +1407,13 @@
     </w:r>
     <w:r>
       <w:rPr>
+        <w:noProof/>
         <w:sz w:val="20"/>
       </w:rPr>
       <mc:AlternateContent>
         <mc:Choice Requires="wps">
           <w:drawing>
-            <wp:anchor distT="0" distB="0" distL="0" distR="0" allowOverlap="1" layoutInCell="1" locked="0" behindDoc="1" simplePos="0" relativeHeight="487547904">
+            <wp:anchor distT="0" distB="0" distL="0" distR="0" simplePos="0" relativeHeight="487547904" behindDoc="1" locked="0" layoutInCell="1" allowOverlap="1" wp14:anchorId="175C35EA" wp14:editId="478D1CF0">
               <wp:simplePos x="0" y="0"/>
               <wp:positionH relativeFrom="page">
                 <wp:posOffset>6005321</wp:posOffset>
@@ -1452,13 +1426,14 @@
               <wp:wrapNone/>
               <wp:docPr id="6" name="Textbox 6"/>
               <wp:cNvGraphicFramePr>
-                <a:graphicFrameLocks/>
+                <a:graphicFrameLocks xmlns:a="http://schemas.openxmlformats.org/drawingml/2006/main"/>
               </wp:cNvGraphicFramePr>
-              <a:graphic>
+              <a:graphic xmlns:a="http://schemas.openxmlformats.org/drawingml/2006/main">
                 <a:graphicData uri="http://schemas.microsoft.com/office/word/2010/wordprocessingShape">
                   <wps:wsp>
-                    <wps:cNvPr id="6" name="Textbox 6"/>
-                    <wps:cNvSpPr txBox="1"/>
+                    <wps:cNvSpPr txBox="1">
+                      <a:spLocks/>
+                    </wps:cNvSpPr>
                     <wps:spPr>
                       <a:xfrm>
                         <a:off x="0" y="0"/>
@@ -1473,8 +1448,7 @@
                         <w:p>
                           <w:pPr>
                             <w:spacing w:before="20"/>
-                            <w:ind w:left="20" w:right="0" w:firstLine="0"/>
-                            <w:jc w:val="left"/>
+                            <w:ind w:left="20"/>
                             <w:rPr>
                               <w:sz w:val="28"/>
                             </w:rPr>
@@ -1491,7 +1465,7 @@
                               <w:spacing w:val="-1"/>
                               <w:sz w:val="28"/>
                             </w:rPr>
-                            <w:t> </w:t>
+                            <w:t xml:space="preserve"> </w:t>
                           </w:r>
                           <w:r>
                             <w:rPr>
@@ -1514,14 +1488,13 @@
         </mc:Choice>
         <mc:Fallback>
           <w:pict>
-            <v:shape style="position:absolute;margin-left:472.859985pt;margin-top:762.275269pt;width:80.8pt;height:18.5pt;mso-position-horizontal-relative:page;mso-position-vertical-relative:page;z-index:-15768576" type="#_x0000_t202" id="docshape5" filled="false" stroked="false">
+            <v:shape w14:anchorId="175C35EA" id="Textbox 6" o:spid="_x0000_s1028" type="#_x0000_t202" style="position:absolute;margin-left:472.85pt;margin-top:762.3pt;width:80.8pt;height:18.5pt;z-index:-15768576;visibility:visible;mso-wrap-style:square;mso-wrap-distance-left:0;mso-wrap-distance-top:0;mso-wrap-distance-right:0;mso-wrap-distance-bottom:0;mso-position-horizontal:absolute;mso-position-horizontal-relative:page;mso-position-vertical:absolute;mso-position-vertical-relative:page;v-text-anchor:top" o:gfxdata="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" filled="f" stroked="f">
               <v:textbox inset="0,0,0,0">
                 <w:txbxContent>
                   <w:p>
                     <w:pPr>
                       <w:spacing w:before="20"/>
-                      <w:ind w:left="20" w:right="0" w:firstLine="0"/>
-                      <w:jc w:val="left"/>
+                      <w:ind w:left="20"/>
                       <w:rPr>
                         <w:sz w:val="28"/>
                       </w:rPr>
@@ -1538,7 +1511,7 @@
                         <w:spacing w:val="-1"/>
                         <w:sz w:val="28"/>
                       </w:rPr>
-                      <w:t> </w:t>
+                      <w:t xml:space="preserve"> </w:t>
                     </w:r>
                     <w:r>
                       <w:rPr>
@@ -1550,7 +1523,7 @@
                   </w:p>
                 </w:txbxContent>
               </v:textbox>
-              <w10:wrap type="none"/>
+              <w10:wrap anchorx="page" anchory="page"/>
             </v:shape>
           </w:pict>
         </mc:Fallback>
@@ -1560,8 +1533,27 @@
 </w:ftr>
 </file>
 
+<file path=word/footnotes.xml><?xml version="1.0" encoding="utf-8"?>
+<w:footnotes xmlns:wpc="http://schemas.microsoft.com/office/word/2010/wordprocessingCanvas" xmlns:cx="http://schemas.microsoft.com/office/drawing/2014/chartex" xmlns:cx1="http://schemas.microsoft.com/office/drawing/2015/9/8/chartex" xmlns:cx2="http://schemas.microsoft.com/office/drawing/2015/10/21/chartex" xmlns:cx3="http://schemas.microsoft.com/office/drawing/2016/5/9/chartex" xmlns:cx4="http://schemas.microsoft.com/office/drawing/2016/5/10/chartex" xmlns:cx5="http://schemas.microsoft.com/office/drawing/2016/5/11/chartex" xmlns:cx6="http://schemas.microsoft.com/office/drawing/2016/5/12/chartex" xmlns:cx7="http://schemas.microsoft.com/office/drawing/2016/5/13/chartex" xmlns:cx8="http://schemas.microsoft.com/office/drawing/2016/5/14/chartex" xmlns:mc="http://schemas.openxmlformats.org/markup-compatibility/2006" xmlns:aink="http://schemas.microsoft.com/office/drawing/2016/ink" xmlns:am3d="http://schemas.microsoft.com/office/drawing/2017/model3d" xmlns:o="urn:schemas-microsoft-com:office:office" xmlns:oel="http://schemas.microsoft.com/office/2019/extlst" xmlns:r="http://schemas.openxmlformats.org/officeDocument/2006/relationships" xmlns:m="http://schemas.openxmlformats.org/officeDocument/2006/math" xmlns:v="urn:schemas-microsoft-com:vml" xmlns:wp14="http://schemas.microsoft.com/office/word/2010/wordprocessingDrawing" xmlns:wp="http://schemas.openxmlformats.org/drawingml/2006/wordprocessingDrawing" xmlns:w10="urn:schemas-microsoft-com:office:word" xmlns:w="http://schemas.openxmlformats.org/wordprocessingml/2006/main" xmlns:w14="http://schemas.microsoft.com/office/word/2010/wordml" xmlns:w15="http://schemas.microsoft.com/office/word/2012/wordml" xmlns:w16cex="http://schemas.microsoft.com/office/word/2018/wordml/cex" xmlns:w16cid="http://schemas.microsoft.com/office/word/2016/wordml/cid" xmlns:w16="http://schemas.microsoft.com/office/word/2018/wordml" xmlns:w16du="http://schemas.microsoft.com/office/word/2023/wordml/word16du" xmlns:w16sdtdh="http://schemas.microsoft.com/office/word/2020/wordml/sdtdatahash" xmlns:w16sdtfl="http://schemas.microsoft.com/office/word/2024/wordml/sdtformatlock" xmlns:w16se="http://schemas.microsoft.com/office/word/2015/wordml/symex" xmlns:wpg="http://schemas.microsoft.com/office/word/2010/wordprocessingGroup" xmlns:wpi="http://schemas.microsoft.com/office/word/2010/wordprocessingInk" xmlns:wne="http://schemas.microsoft.com/office/word/2006/wordml" xmlns:wps="http://schemas.microsoft.com/office/word/2010/wordprocessingShape" mc:Ignorable="w14 w15 w16se w16cid w16 w16cex w16sdtdh w16sdtfl w16du wp14">
+  <w:footnote w:type="separator" w:id="-1">
+    <w:p>
+      <w:r>
+        <w:separator/>
+      </w:r>
+    </w:p>
+  </w:footnote>
+  <w:footnote w:type="continuationSeparator" w:id="0">
+    <w:p>
+      <w:r>
+        <w:continuationSeparator/>
+      </w:r>
+    </w:p>
+  </w:footnote>
+</w:footnotes>
+</file>
+
 <file path=word/header1.xml><?xml version="1.0" encoding="utf-8"?>
-<w:hdr xmlns:mc="http://schemas.openxmlformats.org/markup-compatibility/2006" xmlns:ve="http://schemas.openxmlformats.org/markup-compatibility/2006" xmlns:o="urn:schemas-microsoft-com:office:office" xmlns:r="http://schemas.openxmlformats.org/officeDocument/2006/relationships" xmlns:m="http://schemas.openxmlformats.org/officeDocument/2006/math" xmlns:v="urn:schemas-microsoft-com:vml" xmlns:wp="http://schemas.openxmlformats.org/drawingml/2006/wordprocessingDrawing" xmlns:w10="urn:schemas-microsoft-com:office:word" xmlns:w="http://schemas.openxmlformats.org/wordprocessingml/2006/main" xmlns:wne="http://schemas.microsoft.com/office/word/2006/wordml" xmlns:a="http://schemas.openxmlformats.org/drawingml/2006/main" xmlns:pic="http://schemas.openxmlformats.org/drawingml/2006/picture" xmlns:wpg="http://schemas.microsoft.com/office/word/2010/wordprocessingGroup" xmlns:wps="http://schemas.microsoft.com/office/word/2010/wordprocessingShape" xmlns:w14="http://schemas.microsoft.com/office/word/2010/wordml" mc:Ignorable="w14" xml:space="preserve">
+<w:hdr xmlns:wpc="http://schemas.microsoft.com/office/word/2010/wordprocessingCanvas" xmlns:cx="http://schemas.microsoft.com/office/drawing/2014/chartex" xmlns:cx1="http://schemas.microsoft.com/office/drawing/2015/9/8/chartex" xmlns:cx2="http://schemas.microsoft.com/office/drawing/2015/10/21/chartex" xmlns:cx3="http://schemas.microsoft.com/office/drawing/2016/5/9/chartex" xmlns:cx4="http://schemas.microsoft.com/office/drawing/2016/5/10/chartex" xmlns:cx5="http://schemas.microsoft.com/office/drawing/2016/5/11/chartex" xmlns:cx6="http://schemas.microsoft.com/office/drawing/2016/5/12/chartex" xmlns:cx7="http://schemas.microsoft.com/office/drawing/2016/5/13/chartex" xmlns:cx8="http://schemas.microsoft.com/office/drawing/2016/5/14/chartex" xmlns:mc="http://schemas.openxmlformats.org/markup-compatibility/2006" xmlns:aink="http://schemas.microsoft.com/office/drawing/2016/ink" xmlns:am3d="http://schemas.microsoft.com/office/drawing/2017/model3d" xmlns:o="urn:schemas-microsoft-com:office:office" xmlns:oel="http://schemas.microsoft.com/office/2019/extlst" xmlns:r="http://schemas.openxmlformats.org/officeDocument/2006/relationships" xmlns:m="http://schemas.openxmlformats.org/officeDocument/2006/math" xmlns:v="urn:schemas-microsoft-com:vml" xmlns:wp14="http://schemas.microsoft.com/office/word/2010/wordprocessingDrawing" xmlns:wp="http://schemas.openxmlformats.org/drawingml/2006/wordprocessingDrawing" xmlns:w10="urn:schemas-microsoft-com:office:word" xmlns:w="http://schemas.openxmlformats.org/wordprocessingml/2006/main" xmlns:w14="http://schemas.microsoft.com/office/word/2010/wordml" xmlns:w15="http://schemas.microsoft.com/office/word/2012/wordml" xmlns:w16cex="http://schemas.microsoft.com/office/word/2018/wordml/cex" xmlns:w16cid="http://schemas.microsoft.com/office/word/2016/wordml/cid" xmlns:w16="http://schemas.microsoft.com/office/word/2018/wordml" xmlns:w16du="http://schemas.microsoft.com/office/word/2023/wordml/word16du" xmlns:w16sdtdh="http://schemas.microsoft.com/office/word/2020/wordml/sdtdatahash" xmlns:w16sdtfl="http://schemas.microsoft.com/office/word/2024/wordml/sdtformatlock" xmlns:w16se="http://schemas.microsoft.com/office/word/2015/wordml/symex" xmlns:wpg="http://schemas.microsoft.com/office/word/2010/wordprocessingGroup" xmlns:wpi="http://schemas.microsoft.com/office/word/2010/wordprocessingInk" xmlns:wne="http://schemas.microsoft.com/office/word/2006/wordml" xmlns:wps="http://schemas.microsoft.com/office/word/2010/wordprocessingShape" mc:Ignorable="w14 w15 w16se w16cid w16 w16cex w16sdtdh w16sdtfl w16du wp14">
   <w:p>
     <w:pPr>
       <w:pStyle w:val="BodyText"/>
@@ -1572,10 +1564,11 @@
     </w:pPr>
     <w:r>
       <w:rPr>
+        <w:noProof/>
         <w:sz w:val="20"/>
       </w:rPr>
       <w:drawing>
-        <wp:anchor distT="0" distB="0" distL="0" distR="0" allowOverlap="1" layoutInCell="1" locked="0" behindDoc="1" simplePos="0" relativeHeight="487545344">
+        <wp:anchor distT="0" distB="0" distL="0" distR="0" simplePos="0" relativeHeight="487545344" behindDoc="1" locked="0" layoutInCell="1" allowOverlap="1" wp14:anchorId="2FB11187" wp14:editId="36FA3A9D">
           <wp:simplePos x="0" y="0"/>
           <wp:positionH relativeFrom="page">
             <wp:posOffset>580288</wp:posOffset>
@@ -1588,11 +1581,11 @@
           <wp:wrapNone/>
           <wp:docPr id="1" name="Image 1"/>
           <wp:cNvGraphicFramePr>
-            <a:graphicFrameLocks/>
+            <a:graphicFrameLocks xmlns:a="http://schemas.openxmlformats.org/drawingml/2006/main"/>
           </wp:cNvGraphicFramePr>
-          <a:graphic>
+          <a:graphic xmlns:a="http://schemas.openxmlformats.org/drawingml/2006/main">
             <a:graphicData uri="http://schemas.openxmlformats.org/drawingml/2006/picture">
-              <pic:pic>
+              <pic:pic xmlns:pic="http://schemas.openxmlformats.org/drawingml/2006/picture">
                 <pic:nvPicPr>
                   <pic:cNvPr id="1" name="Image 1"/>
                   <pic:cNvPicPr/>
@@ -1620,12 +1613,13 @@
     </w:r>
     <w:r>
       <w:rPr>
+        <w:noProof/>
         <w:sz w:val="20"/>
       </w:rPr>
       <mc:AlternateContent>
         <mc:Choice Requires="wps">
           <w:drawing>
-            <wp:anchor distT="0" distB="0" distL="0" distR="0" allowOverlap="1" layoutInCell="1" locked="0" behindDoc="1" simplePos="0" relativeHeight="487545856">
+            <wp:anchor distT="0" distB="0" distL="0" distR="0" simplePos="0" relativeHeight="487545856" behindDoc="1" locked="0" layoutInCell="1" allowOverlap="1" wp14:anchorId="38A77952" wp14:editId="0BE601EE">
               <wp:simplePos x="0" y="0"/>
               <wp:positionH relativeFrom="page">
                 <wp:posOffset>457200</wp:posOffset>
@@ -1638,13 +1632,14 @@
               <wp:wrapNone/>
               <wp:docPr id="2" name="Graphic 2"/>
               <wp:cNvGraphicFramePr>
-                <a:graphicFrameLocks/>
+                <a:graphicFrameLocks xmlns:a="http://schemas.openxmlformats.org/drawingml/2006/main"/>
               </wp:cNvGraphicFramePr>
-              <a:graphic>
+              <a:graphic xmlns:a="http://schemas.openxmlformats.org/drawingml/2006/main">
                 <a:graphicData uri="http://schemas.microsoft.com/office/word/2010/wordprocessingShape">
                   <wps:wsp>
-                    <wps:cNvPr id="2" name="Graphic 2"/>
-                    <wps:cNvSpPr/>
+                    <wps:cNvSpPr>
+                      <a:spLocks/>
+                    </wps:cNvSpPr>
                     <wps:spPr>
                       <a:xfrm>
                         <a:off x="0" y="0"/>
@@ -1719,10 +1714,9 @@
         </mc:Choice>
         <mc:Fallback>
           <w:pict>
-            <v:shape style="position:absolute;margin-left:36pt;margin-top:102.859947pt;width:523.4500pt;height:1.45pt;mso-position-horizontal-relative:page;mso-position-vertical-relative:page;z-index:-15770624" id="docshape1" coordorigin="720,2057" coordsize="10469,29" path="m2045,2057l2016,2057,2016,2057,720,2057,720,2086,2016,2086,2016,2086,2045,2086,2045,2057xm11188,2057l2045,2057,2045,2086,11188,2086,11188,2057xe" filled="true" fillcolor="#000000" stroked="false">
+            <v:shape w14:anchorId="56ECBBA7" id="Graphic 2" o:spid="_x0000_s1026" style="position:absolute;margin-left:36pt;margin-top:102.85pt;width:523.45pt;height:1.45pt;z-index:-15770624;visibility:visible;mso-wrap-style:square;mso-wrap-distance-left:0;mso-wrap-distance-top:0;mso-wrap-distance-right:0;mso-wrap-distance-bottom:0;mso-position-horizontal:absolute;mso-position-horizontal-relative:page;mso-position-vertical:absolute;mso-position-vertical-relative:page;v-text-anchor:top" coordsize="6647815,18415" o:gfxdata="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" path="m841489,l823264,,,,,18288r823214,l841489,18288,841489,xem6647307,l841502,r,18288l6647307,18288r,-18288xe" fillcolor="black" stroked="f">
               <v:path arrowok="t"/>
-              <v:fill type="solid"/>
-              <w10:wrap type="none"/>
+              <w10:wrap anchorx="page" anchory="page"/>
             </v:shape>
           </w:pict>
         </mc:Fallback>
@@ -1730,12 +1724,13 @@
     </w:r>
     <w:r>
       <w:rPr>
+        <w:noProof/>
         <w:sz w:val="20"/>
       </w:rPr>
       <mc:AlternateContent>
         <mc:Choice Requires="wps">
           <w:drawing>
-            <wp:anchor distT="0" distB="0" distL="0" distR="0" allowOverlap="1" layoutInCell="1" locked="0" behindDoc="1" simplePos="0" relativeHeight="487546368">
+            <wp:anchor distT="0" distB="0" distL="0" distR="0" simplePos="0" relativeHeight="487546368" behindDoc="1" locked="0" layoutInCell="1" allowOverlap="1" wp14:anchorId="11E4B159" wp14:editId="0D746B6B">
               <wp:simplePos x="0" y="0"/>
               <wp:positionH relativeFrom="page">
                 <wp:posOffset>1444497</wp:posOffset>
@@ -1748,13 +1743,14 @@
               <wp:wrapNone/>
               <wp:docPr id="3" name="Textbox 3"/>
               <wp:cNvGraphicFramePr>
-                <a:graphicFrameLocks/>
+                <a:graphicFrameLocks xmlns:a="http://schemas.openxmlformats.org/drawingml/2006/main"/>
               </wp:cNvGraphicFramePr>
-              <a:graphic>
+              <a:graphic xmlns:a="http://schemas.openxmlformats.org/drawingml/2006/main">
                 <a:graphicData uri="http://schemas.microsoft.com/office/word/2010/wordprocessingShape">
                   <wps:wsp>
-                    <wps:cNvPr id="3" name="Textbox 3"/>
-                    <wps:cNvSpPr txBox="1"/>
+                    <wps:cNvSpPr txBox="1">
+                      <a:spLocks/>
+                    </wps:cNvSpPr>
                     <wps:spPr>
                       <a:xfrm>
                         <a:off x="0" y="0"/>
@@ -1769,7 +1765,6 @@
                         <w:p>
                           <w:pPr>
                             <w:spacing w:before="20"/>
-                            <w:ind w:left="0" w:right="0" w:firstLine="0"/>
                             <w:jc w:val="center"/>
                             <w:rPr>
                               <w:b/>
@@ -1789,7 +1784,7 @@
                               <w:spacing w:val="-13"/>
                               <w:sz w:val="28"/>
                             </w:rPr>
-                            <w:t> </w:t>
+                            <w:t xml:space="preserve"> </w:t>
                           </w:r>
                           <w:r>
                             <w:rPr>
@@ -1804,7 +1799,7 @@
                               <w:spacing w:val="-9"/>
                               <w:sz w:val="28"/>
                             </w:rPr>
-                            <w:t> </w:t>
+                            <w:t xml:space="preserve"> </w:t>
                           </w:r>
                           <w:r>
                             <w:rPr>
@@ -1819,7 +1814,7 @@
                               <w:spacing w:val="-11"/>
                               <w:sz w:val="28"/>
                             </w:rPr>
-                            <w:t> </w:t>
+                            <w:t xml:space="preserve"> </w:t>
                           </w:r>
                           <w:r>
                             <w:rPr>
@@ -1834,7 +1829,7 @@
                               <w:spacing w:val="-10"/>
                               <w:sz w:val="28"/>
                             </w:rPr>
-                            <w:t> </w:t>
+                            <w:t xml:space="preserve"> </w:t>
                           </w:r>
                           <w:r>
                             <w:rPr>
@@ -1849,7 +1844,7 @@
                               <w:spacing w:val="-8"/>
                               <w:sz w:val="28"/>
                             </w:rPr>
-                            <w:t> </w:t>
+                            <w:t xml:space="preserve"> </w:t>
                           </w:r>
                           <w:r>
                             <w:rPr>
@@ -1863,7 +1858,6 @@
                         <w:p>
                           <w:pPr>
                             <w:spacing w:before="213"/>
-                            <w:ind w:left="0" w:right="0" w:firstLine="0"/>
                             <w:jc w:val="center"/>
                             <w:rPr>
                               <w:b/>
@@ -1883,7 +1877,7 @@
                               <w:spacing w:val="-10"/>
                               <w:sz w:val="28"/>
                             </w:rPr>
-                            <w:t> </w:t>
+                            <w:t xml:space="preserve"> </w:t>
                           </w:r>
                           <w:r>
                             <w:rPr>
@@ -1907,7 +1901,7 @@
                               <w:position w:val="7"/>
                               <w:sz w:val="18"/>
                             </w:rPr>
-                            <w:t> </w:t>
+                            <w:t xml:space="preserve"> </w:t>
                           </w:r>
                           <w:r>
                             <w:rPr>
@@ -1922,7 +1916,7 @@
                               <w:spacing w:val="-7"/>
                               <w:sz w:val="28"/>
                             </w:rPr>
-                            <w:t> </w:t>
+                            <w:t xml:space="preserve"> </w:t>
                           </w:r>
                           <w:r>
                             <w:rPr>
@@ -1937,7 +1931,7 @@
                               <w:spacing w:val="-5"/>
                               <w:sz w:val="28"/>
                             </w:rPr>
-                            <w:t> </w:t>
+                            <w:t xml:space="preserve"> </w:t>
                           </w:r>
                           <w:r>
                             <w:rPr>
@@ -1952,7 +1946,7 @@
                               <w:spacing w:val="-4"/>
                               <w:sz w:val="28"/>
                             </w:rPr>
-                            <w:t> </w:t>
+                            <w:t xml:space="preserve"> </w:t>
                           </w:r>
                           <w:r>
                             <w:rPr>
@@ -1967,7 +1961,7 @@
                               <w:spacing w:val="-8"/>
                               <w:sz w:val="28"/>
                             </w:rPr>
-                            <w:t> </w:t>
+                            <w:t xml:space="preserve"> </w:t>
                           </w:r>
                           <w:r>
                             <w:rPr>
@@ -1982,7 +1976,7 @@
                               <w:spacing w:val="-6"/>
                               <w:sz w:val="28"/>
                             </w:rPr>
-                            <w:t> </w:t>
+                            <w:t xml:space="preserve"> </w:t>
                           </w:r>
                           <w:r>
                             <w:rPr>
@@ -1997,7 +1991,7 @@
                               <w:spacing w:val="-6"/>
                               <w:sz w:val="28"/>
                             </w:rPr>
-                            <w:t> </w:t>
+                            <w:t xml:space="preserve"> </w:t>
                           </w:r>
                           <w:r>
                             <w:rPr>
@@ -2021,17 +2015,16 @@
         </mc:Choice>
         <mc:Fallback>
           <w:pict>
-            <v:shapetype id="_x0000_t202" o:spt="202" coordsize="21600,21600" path="m,l,21600r21600,l21600,xe">
+            <v:shapetype w14:anchorId="11E4B159" id="_x0000_t202" coordsize="21600,21600" o:spt="202" path="m,l,21600r21600,l21600,xe">
               <v:stroke joinstyle="miter"/>
               <v:path gradientshapeok="t" o:connecttype="rect"/>
             </v:shapetype>
-            <v:shape style="position:absolute;margin-left:113.739998pt;margin-top:50.93924pt;width:432.55pt;height:45.5pt;mso-position-horizontal-relative:page;mso-position-vertical-relative:page;z-index:-15770112" type="#_x0000_t202" id="docshape2" filled="false" stroked="false">
+            <v:shape id="Textbox 3" o:spid="_x0000_s1026" type="#_x0000_t202" style="position:absolute;margin-left:113.75pt;margin-top:50.95pt;width:432.55pt;height:45.5pt;z-index:-15770112;visibility:visible;mso-wrap-style:square;mso-wrap-distance-left:0;mso-wrap-distance-top:0;mso-wrap-distance-right:0;mso-wrap-distance-bottom:0;mso-position-horizontal:absolute;mso-position-horizontal-relative:page;mso-position-vertical:absolute;mso-position-vertical-relative:page;v-text-anchor:top" o:gfxdata="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" filled="f" stroked="f">
               <v:textbox inset="0,0,0,0">
                 <w:txbxContent>
                   <w:p>
                     <w:pPr>
                       <w:spacing w:before="20"/>
-                      <w:ind w:left="0" w:right="0" w:firstLine="0"/>
                       <w:jc w:val="center"/>
                       <w:rPr>
                         <w:b/>
@@ -2051,7 +2044,7 @@
                         <w:spacing w:val="-13"/>
                         <w:sz w:val="28"/>
                       </w:rPr>
-                      <w:t> </w:t>
+                      <w:t xml:space="preserve"> </w:t>
                     </w:r>
                     <w:r>
                       <w:rPr>
@@ -2066,7 +2059,7 @@
                         <w:spacing w:val="-9"/>
                         <w:sz w:val="28"/>
                       </w:rPr>
-                      <w:t> </w:t>
+                      <w:t xml:space="preserve"> </w:t>
                     </w:r>
                     <w:r>
                       <w:rPr>
@@ -2081,7 +2074,7 @@
                         <w:spacing w:val="-11"/>
                         <w:sz w:val="28"/>
                       </w:rPr>
-                      <w:t> </w:t>
+                      <w:t xml:space="preserve"> </w:t>
                     </w:r>
                     <w:r>
                       <w:rPr>
@@ -2096,7 +2089,7 @@
                         <w:spacing w:val="-10"/>
                         <w:sz w:val="28"/>
                       </w:rPr>
-                      <w:t> </w:t>
+                      <w:t xml:space="preserve"> </w:t>
                     </w:r>
                     <w:r>
                       <w:rPr>
@@ -2111,7 +2104,7 @@
                         <w:spacing w:val="-8"/>
                         <w:sz w:val="28"/>
                       </w:rPr>
-                      <w:t> </w:t>
+                      <w:t xml:space="preserve"> </w:t>
                     </w:r>
                     <w:r>
                       <w:rPr>
@@ -2125,7 +2118,6 @@
                   <w:p>
                     <w:pPr>
                       <w:spacing w:before="213"/>
-                      <w:ind w:left="0" w:right="0" w:firstLine="0"/>
                       <w:jc w:val="center"/>
                       <w:rPr>
                         <w:b/>
@@ -2145,7 +2137,7 @@
                         <w:spacing w:val="-10"/>
                         <w:sz w:val="28"/>
                       </w:rPr>
-                      <w:t> </w:t>
+                      <w:t xml:space="preserve"> </w:t>
                     </w:r>
                     <w:r>
                       <w:rPr>
@@ -2169,7 +2161,7 @@
                         <w:position w:val="7"/>
                         <w:sz w:val="18"/>
                       </w:rPr>
-                      <w:t> </w:t>
+                      <w:t xml:space="preserve"> </w:t>
                     </w:r>
                     <w:r>
                       <w:rPr>
@@ -2184,7 +2176,7 @@
                         <w:spacing w:val="-7"/>
                         <w:sz w:val="28"/>
                       </w:rPr>
-                      <w:t> </w:t>
+                      <w:t xml:space="preserve"> </w:t>
                     </w:r>
                     <w:r>
                       <w:rPr>
@@ -2199,7 +2191,7 @@
                         <w:spacing w:val="-5"/>
                         <w:sz w:val="28"/>
                       </w:rPr>
-                      <w:t> </w:t>
+                      <w:t xml:space="preserve"> </w:t>
                     </w:r>
                     <w:r>
                       <w:rPr>
@@ -2214,7 +2206,7 @@
                         <w:spacing w:val="-4"/>
                         <w:sz w:val="28"/>
                       </w:rPr>
-                      <w:t> </w:t>
+                      <w:t xml:space="preserve"> </w:t>
                     </w:r>
                     <w:r>
                       <w:rPr>
@@ -2229,7 +2221,7 @@
                         <w:spacing w:val="-8"/>
                         <w:sz w:val="28"/>
                       </w:rPr>
-                      <w:t> </w:t>
+                      <w:t xml:space="preserve"> </w:t>
                     </w:r>
                     <w:r>
                       <w:rPr>
@@ -2244,7 +2236,7 @@
                         <w:spacing w:val="-6"/>
                         <w:sz w:val="28"/>
                       </w:rPr>
-                      <w:t> </w:t>
+                      <w:t xml:space="preserve"> </w:t>
                     </w:r>
                     <w:r>
                       <w:rPr>
@@ -2259,7 +2251,7 @@
                         <w:spacing w:val="-6"/>
                         <w:sz w:val="28"/>
                       </w:rPr>
-                      <w:t> </w:t>
+                      <w:t xml:space="preserve"> </w:t>
                     </w:r>
                     <w:r>
                       <w:rPr>
@@ -2272,7 +2264,7 @@
                   </w:p>
                 </w:txbxContent>
               </v:textbox>
-              <w10:wrap type="none"/>
+              <w10:wrap anchorx="page" anchory="page"/>
             </v:shape>
           </w:pict>
         </mc:Fallback>
@@ -2283,14 +2275,14 @@
 </file>
 
 <file path=word/styles.xml><?xml version="1.0" encoding="utf-8"?>
-<w:styles xmlns:r="http://schemas.openxmlformats.org/officeDocument/2006/relationships" xmlns:w="http://schemas.openxmlformats.org/wordprocessingml/2006/main">
+<w:styles xmlns:mc="http://schemas.openxmlformats.org/markup-compatibility/2006" xmlns:r="http://schemas.openxmlformats.org/officeDocument/2006/relationships" xmlns:w="http://schemas.openxmlformats.org/wordprocessingml/2006/main" xmlns:w14="http://schemas.microsoft.com/office/word/2010/wordml" xmlns:w15="http://schemas.microsoft.com/office/word/2012/wordml" xmlns:w16cex="http://schemas.microsoft.com/office/word/2018/wordml/cex" xmlns:w16cid="http://schemas.microsoft.com/office/word/2016/wordml/cid" xmlns:w16="http://schemas.microsoft.com/office/word/2018/wordml" xmlns:w16du="http://schemas.microsoft.com/office/word/2023/wordml/word16du" xmlns:w16sdtdh="http://schemas.microsoft.com/office/word/2020/wordml/sdtdatahash" xmlns:w16sdtfl="http://schemas.microsoft.com/office/word/2024/wordml/sdtformatlock" xmlns:w16se="http://schemas.microsoft.com/office/word/2015/wordml/symex" mc:Ignorable="w14 w15 w16se w16cid w16 w16cex w16sdtdh w16sdtfl w16du">
   <w:docDefaults>
     <w:rPrDefault>
       <w:rPr>
-        <w:rFonts w:cstheme="minorBidi" w:hAnsiTheme="minorHAnsi" w:eastAsiaTheme="minorHAnsi" w:asciiTheme="minorHAnsi"/>
+        <w:rFonts w:asciiTheme="minorHAnsi" w:eastAsiaTheme="minorHAnsi" w:hAnsiTheme="minorHAnsi" w:cstheme="minorBidi"/>
         <w:sz w:val="22"/>
         <w:szCs w:val="22"/>
-        <w:lang w:val="en-US" w:bidi="ar-SA" w:eastAsia="en-US"/>
+        <w:lang w:val="en-US" w:eastAsia="en-US" w:bidi="ar-SA"/>
       </w:rPr>
     </w:rPrDefault>
     <w:pPrDefault>
@@ -2298,115 +2290,520 @@
         <w:widowControl w:val="0"/>
         <w:autoSpaceDE w:val="0"/>
         <w:autoSpaceDN w:val="0"/>
-        <w:spacing w:lineRule="auto" w:line="240" w:before="0" w:after="0"/>
-        <w:ind w:left="0" w:right="0"/>
-        <w:jc w:val="left"/>
       </w:pPr>
     </w:pPrDefault>
   </w:docDefaults>
-  <w:style w:styleId="DefaultParagraphFont" w:default="1" w:type="character">
+  <w:latentStyles w:defLockedState="0" w:defUIPriority="99" w:defSemiHidden="0" w:defUnhideWhenUsed="0" w:defQFormat="0" w:count="376">
+    <w:lsdException w:name="Normal" w:uiPriority="0" w:qFormat="1"/>
+    <w:lsdException w:name="heading 1" w:uiPriority="9" w:qFormat="1"/>
+    <w:lsdException w:name="heading 2" w:semiHidden="1" w:uiPriority="9" w:unhideWhenUsed="1" w:qFormat="1"/>
+    <w:lsdException w:name="heading 3" w:semiHidden="1" w:uiPriority="9" w:unhideWhenUsed="1" w:qFormat="1"/>
+    <w:lsdException w:name="heading 4" w:semiHidden="1" w:uiPriority="9" w:unhideWhenUsed="1" w:qFormat="1"/>
+    <w:lsdException w:name="heading 5" w:semiHidden="1" w:uiPriority="9" w:unhideWhenUsed="1" w:qFormat="1"/>
+    <w:lsdException w:name="heading 6" w:semiHidden="1" w:uiPriority="9" w:unhideWhenUsed="1" w:qFormat="1"/>
+    <w:lsdException w:name="heading 7" w:semiHidden="1" w:uiPriority="9" w:unhideWhenUsed="1" w:qFormat="1"/>
+    <w:lsdException w:name="heading 8" w:semiHidden="1" w:uiPriority="9" w:unhideWhenUsed="1" w:qFormat="1"/>
+    <w:lsdException w:name="heading 9" w:semiHidden="1" w:uiPriority="9" w:unhideWhenUsed="1" w:qFormat="1"/>
+    <w:lsdException w:name="index 1" w:semiHidden="1" w:unhideWhenUsed="1"/>
+    <w:lsdException w:name="index 2" w:semiHidden="1" w:unhideWhenUsed="1"/>
+    <w:lsdException w:name="index 3" w:semiHidden="1" w:unhideWhenUsed="1"/>
+    <w:lsdException w:name="index 4" w:semiHidden="1" w:unhideWhenUsed="1"/>
+    <w:lsdException w:name="index 5" w:semiHidden="1" w:unhideWhenUsed="1"/>
+    <w:lsdException w:name="index 6" w:semiHidden="1" w:unhideWhenUsed="1"/>
+    <w:lsdException w:name="index 7" w:semiHidden="1" w:unhideWhenUsed="1"/>
+    <w:lsdException w:name="index 8" w:semiHidden="1" w:unhideWhenUsed="1"/>
+    <w:lsdException w:name="index 9" w:semiHidden="1" w:unhideWhenUsed="1"/>
+    <w:lsdException w:name="toc 1" w:semiHidden="1" w:uiPriority="39" w:unhideWhenUsed="1"/>
+    <w:lsdException w:name="toc 2" w:semiHidden="1" w:uiPriority="39" w:unhideWhenUsed="1"/>
+    <w:lsdException w:name="toc 3" w:semiHidden="1" w:uiPriority="39" w:unhideWhenUsed="1"/>
+    <w:lsdException w:name="toc 4" w:semiHidden="1" w:uiPriority="39" w:unhideWhenUsed="1"/>
+    <w:lsdException w:name="toc 5" w:semiHidden="1" w:uiPriority="39" w:unhideWhenUsed="1"/>
+    <w:lsdException w:name="toc 6" w:semiHidden="1" w:uiPriority="39" w:unhideWhenUsed="1"/>
+    <w:lsdException w:name="toc 7" w:semiHidden="1" w:uiPriority="39" w:unhideWhenUsed="1"/>
+    <w:lsdException w:name="toc 8" w:semiHidden="1" w:uiPriority="39" w:unhideWhenUsed="1"/>
+    <w:lsdException w:name="toc 9" w:semiHidden="1" w:uiPriority="39" w:unhideWhenUsed="1"/>
+    <w:lsdException w:name="Normal Indent" w:semiHidden="1" w:unhideWhenUsed="1"/>
+    <w:lsdException w:name="footnote text" w:semiHidden="1" w:unhideWhenUsed="1"/>
+    <w:lsdException w:name="annotation text" w:semiHidden="1" w:unhideWhenUsed="1"/>
+    <w:lsdException w:name="header" w:semiHidden="1" w:unhideWhenUsed="1"/>
+    <w:lsdException w:name="footer" w:semiHidden="1" w:unhideWhenUsed="1"/>
+    <w:lsdException w:name="index heading" w:semiHidden="1" w:unhideWhenUsed="1"/>
+    <w:lsdException w:name="caption" w:semiHidden="1" w:uiPriority="35" w:unhideWhenUsed="1" w:qFormat="1"/>
+    <w:lsdException w:name="table of figures" w:semiHidden="1" w:unhideWhenUsed="1"/>
+    <w:lsdException w:name="envelope address" w:semiHidden="1" w:unhideWhenUsed="1"/>
+    <w:lsdException w:name="envelope return" w:semiHidden="1" w:unhideWhenUsed="1"/>
+    <w:lsdException w:name="footnote reference" w:semiHidden="1" w:unhideWhenUsed="1"/>
+    <w:lsdException w:name="annotation reference" w:semiHidden="1" w:unhideWhenUsed="1"/>
+    <w:lsdException w:name="line number" w:semiHidden="1" w:unhideWhenUsed="1"/>
+    <w:lsdException w:name="page number" w:semiHidden="1" w:unhideWhenUsed="1"/>
+    <w:lsdException w:name="endnote reference" w:semiHidden="1" w:unhideWhenUsed="1"/>
+    <w:lsdException w:name="endnote text" w:semiHidden="1" w:unhideWhenUsed="1"/>
+    <w:lsdException w:name="table of authorities" w:semiHidden="1" w:unhideWhenUsed="1"/>
+    <w:lsdException w:name="macro" w:semiHidden="1" w:unhideWhenUsed="1"/>
+    <w:lsdException w:name="toa heading" w:semiHidden="1" w:unhideWhenUsed="1"/>
+    <w:lsdException w:name="List" w:semiHidden="1" w:unhideWhenUsed="1"/>
+    <w:lsdException w:name="List Bullet" w:semiHidden="1" w:unhideWhenUsed="1"/>
+    <w:lsdException w:name="List Number" w:semiHidden="1" w:unhideWhenUsed="1"/>
+    <w:lsdException w:name="List 2" w:semiHidden="1" w:unhideWhenUsed="1"/>
+    <w:lsdException w:name="List 3" w:semiHidden="1" w:unhideWhenUsed="1"/>
+    <w:lsdException w:name="List 4" w:semiHidden="1" w:unhideWhenUsed="1"/>
+    <w:lsdException w:name="List 5" w:semiHidden="1" w:unhideWhenUsed="1"/>
+    <w:lsdException w:name="List Bullet 2" w:semiHidden="1" w:unhideWhenUsed="1"/>
+    <w:lsdException w:name="List Bullet 3" w:semiHidden="1" w:unhideWhenUsed="1"/>
+    <w:lsdException w:name="List Bullet 4" w:semiHidden="1" w:unhideWhenUsed="1"/>
+    <w:lsdException w:name="List Bullet 5" w:semiHidden="1" w:unhideWhenUsed="1"/>
+    <w:lsdException w:name="List Number 2" w:semiHidden="1" w:unhideWhenUsed="1"/>
+    <w:lsdException w:name="List Number 3" w:semiHidden="1" w:unhideWhenUsed="1"/>
+    <w:lsdException w:name="List Number 4" w:semiHidden="1" w:unhideWhenUsed="1"/>
+    <w:lsdException w:name="List Number 5" w:semiHidden="1" w:unhideWhenUsed="1"/>
+    <w:lsdException w:name="Title" w:uiPriority="10" w:qFormat="1"/>
+    <w:lsdException w:name="Closing" w:semiHidden="1" w:unhideWhenUsed="1"/>
+    <w:lsdException w:name="Signature" w:semiHidden="1" w:unhideWhenUsed="1"/>
+    <w:lsdException w:name="Default Paragraph Font" w:semiHidden="1" w:uiPriority="1" w:unhideWhenUsed="1"/>
+    <w:lsdException w:name="Body Text" w:semiHidden="1" w:unhideWhenUsed="1"/>
+    <w:lsdException w:name="Body Text Indent" w:semiHidden="1" w:unhideWhenUsed="1"/>
+    <w:lsdException w:name="List Continue" w:semiHidden="1" w:unhideWhenUsed="1"/>
+    <w:lsdException w:name="List Continue 2" w:semiHidden="1" w:unhideWhenUsed="1"/>
+    <w:lsdException w:name="List Continue 3" w:semiHidden="1" w:unhideWhenUsed="1"/>
+    <w:lsdException w:name="List Continue 4" w:semiHidden="1" w:unhideWhenUsed="1"/>
+    <w:lsdException w:name="List Continue 5" w:semiHidden="1" w:unhideWhenUsed="1"/>
+    <w:lsdException w:name="Message Header" w:semiHidden="1" w:unhideWhenUsed="1"/>
+    <w:lsdException w:name="Subtitle" w:uiPriority="11" w:qFormat="1"/>
+    <w:lsdException w:name="Salutation" w:semiHidden="1" w:unhideWhenUsed="1"/>
+    <w:lsdException w:name="Date" w:semiHidden="1" w:unhideWhenUsed="1"/>
+    <w:lsdException w:name="Body Text First Indent" w:semiHidden="1" w:unhideWhenUsed="1"/>
+    <w:lsdException w:name="Body Text First Indent 2" w:semiHidden="1" w:unhideWhenUsed="1"/>
+    <w:lsdException w:name="Note Heading" w:semiHidden="1" w:unhideWhenUsed="1"/>
+    <w:lsdException w:name="Body Text 2" w:semiHidden="1" w:unhideWhenUsed="1"/>
+    <w:lsdException w:name="Body Text 3" w:semiHidden="1" w:unhideWhenUsed="1"/>
+    <w:lsdException w:name="Body Text Indent 2" w:semiHidden="1" w:unhideWhenUsed="1"/>
+    <w:lsdException w:name="Body Text Indent 3" w:semiHidden="1" w:unhideWhenUsed="1"/>
+    <w:lsdException w:name="Block Text" w:semiHidden="1" w:unhideWhenUsed="1"/>
+    <w:lsdException w:name="Hyperlink" w:semiHidden="1" w:unhideWhenUsed="1"/>
+    <w:lsdException w:name="FollowedHyperlink" w:semiHidden="1" w:unhideWhenUsed="1"/>
+    <w:lsdException w:name="Strong" w:uiPriority="22" w:qFormat="1"/>
+    <w:lsdException w:name="Emphasis" w:uiPriority="20" w:qFormat="1"/>
+    <w:lsdException w:name="Document Map" w:semiHidden="1" w:unhideWhenUsed="1"/>
+    <w:lsdException w:name="Plain Text" w:semiHidden="1" w:unhideWhenUsed="1"/>
+    <w:lsdException w:name="E-mail Signature" w:semiHidden="1" w:unhideWhenUsed="1"/>
+    <w:lsdException w:name="HTML Top of Form" w:semiHidden="1" w:unhideWhenUsed="1"/>
+    <w:lsdException w:name="HTML Bottom of Form" w:semiHidden="1" w:unhideWhenUsed="1"/>
+    <w:lsdException w:name="Normal (Web)" w:semiHidden="1" w:unhideWhenUsed="1"/>
+    <w:lsdException w:name="HTML Acronym" w:semiHidden="1" w:unhideWhenUsed="1"/>
+    <w:lsdException w:name="HTML Address" w:semiHidden="1" w:unhideWhenUsed="1"/>
+    <w:lsdException w:name="HTML Cite" w:semiHidden="1" w:unhideWhenUsed="1"/>
+    <w:lsdException w:name="HTML Code" w:semiHidden="1" w:unhideWhenUsed="1"/>
+    <w:lsdException w:name="HTML Definition" w:semiHidden="1" w:unhideWhenUsed="1"/>
+    <w:lsdException w:name="HTML Keyboard" w:semiHidden="1" w:unhideWhenUsed="1"/>
+    <w:lsdException w:name="HTML Preformatted" w:semiHidden="1" w:unhideWhenUsed="1"/>
+    <w:lsdException w:name="HTML Sample" w:semiHidden="1" w:unhideWhenUsed="1"/>
+    <w:lsdException w:name="HTML Typewriter" w:semiHidden="1" w:unhideWhenUsed="1"/>
+    <w:lsdException w:name="HTML Variable" w:semiHidden="1" w:unhideWhenUsed="1"/>
+    <w:lsdException w:name="Normal Table" w:semiHidden="1" w:unhideWhenUsed="1"/>
+    <w:lsdException w:name="annotation subject" w:semiHidden="1" w:unhideWhenUsed="1"/>
+    <w:lsdException w:name="No List" w:semiHidden="1" w:unhideWhenUsed="1"/>
+    <w:lsdException w:name="Outline List 1" w:semiHidden="1" w:unhideWhenUsed="1"/>
+    <w:lsdException w:name="Outline List 2" w:semiHidden="1" w:unhideWhenUsed="1"/>
+    <w:lsdException w:name="Outline List 3" w:semiHidden="1" w:unhideWhenUsed="1"/>
+    <w:lsdException w:name="Table Simple 1" w:semiHidden="1" w:unhideWhenUsed="1"/>
+    <w:lsdException w:name="Table Simple 2" w:semiHidden="1" w:unhideWhenUsed="1"/>
+    <w:lsdException w:name="Table Simple 3" w:semiHidden="1" w:unhideWhenUsed="1"/>
+    <w:lsdException w:name="Table Classic 1" w:semiHidden="1" w:unhideWhenUsed="1"/>
+    <w:lsdException w:name="Table Classic 2" w:semiHidden="1" w:unhideWhenUsed="1"/>
+    <w:lsdException w:name="Table Classic 3" w:semiHidden="1" w:unhideWhenUsed="1"/>
+    <w:lsdException w:name="Table Classic 4" w:semiHidden="1" w:unhideWhenUsed="1"/>
+    <w:lsdException w:name="Table Colorful 1" w:semiHidden="1" w:unhideWhenUsed="1"/>
+    <w:lsdException w:name="Table Colorful 2" w:semiHidden="1" w:unhideWhenUsed="1"/>
+    <w:lsdException w:name="Table Colorful 3" w:semiHidden="1" w:unhideWhenUsed="1"/>
+    <w:lsdException w:name="Table Columns 1" w:semiHidden="1" w:unhideWhenUsed="1"/>
+    <w:lsdException w:name="Table Columns 2" w:semiHidden="1" w:unhideWhenUsed="1"/>
+    <w:lsdException w:name="Table Columns 3" w:semiHidden="1" w:unhideWhenUsed="1"/>
+    <w:lsdException w:name="Table Columns 4" w:semiHidden="1" w:unhideWhenUsed="1"/>
+    <w:lsdException w:name="Table Columns 5" w:semiHidden="1" w:unhideWhenUsed="1"/>
+    <w:lsdException w:name="Table Grid 1" w:semiHidden="1" w:unhideWhenUsed="1"/>
+    <w:lsdException w:name="Table Grid 2" w:semiHidden="1" w:unhideWhenUsed="1"/>
+    <w:lsdException w:name="Table Grid 3" w:semiHidden="1" w:unhideWhenUsed="1"/>
+    <w:lsdException w:name="Table Grid 4" w:semiHidden="1" w:unhideWhenUsed="1"/>
+    <w:lsdException w:name="Table Grid 5" w:semiHidden="1" w:unhideWhenUsed="1"/>
+    <w:lsdException w:name="Table Grid 6" w:semiHidden="1" w:unhideWhenUsed="1"/>
+    <w:lsdException w:name="Table Grid 7" w:semiHidden="1" w:unhideWhenUsed="1"/>
+    <w:lsdException w:name="Table Grid 8" w:semiHidden="1" w:unhideWhenUsed="1"/>
+    <w:lsdException w:name="Table List 1" w:semiHidden="1" w:unhideWhenUsed="1"/>
+    <w:lsdException w:name="Table List 2" w:semiHidden="1" w:unhideWhenUsed="1"/>
+    <w:lsdException w:name="Table List 3" w:semiHidden="1" w:unhideWhenUsed="1"/>
+    <w:lsdException w:name="Table List 4" w:semiHidden="1" w:unhideWhenUsed="1"/>
+    <w:lsdException w:name="Table List 5" w:semiHidden="1" w:unhideWhenUsed="1"/>
+    <w:lsdException w:name="Table List 6" w:semiHidden="1" w:unhideWhenUsed="1"/>
+    <w:lsdException w:name="Table List 7" w:semiHidden="1" w:unhideWhenUsed="1"/>
+    <w:lsdException w:name="Table List 8" w:semiHidden="1" w:unhideWhenUsed="1"/>
+    <w:lsdException w:name="Table 3D effects 1" w:semiHidden="1" w:unhideWhenUsed="1"/>
+    <w:lsdException w:name="Table 3D effects 2" w:semiHidden="1" w:unhideWhenUsed="1"/>
+    <w:lsdException w:name="Table 3D effects 3" w:semiHidden="1" w:unhideWhenUsed="1"/>
+    <w:lsdException w:name="Table Contemporary" w:semiHidden="1" w:unhideWhenUsed="1"/>
+    <w:lsdException w:name="Table Elegant" w:semiHidden="1" w:unhideWhenUsed="1"/>
+    <w:lsdException w:name="Table Professional" w:semiHidden="1" w:unhideWhenUsed="1"/>
+    <w:lsdException w:name="Table Subtle 1" w:semiHidden="1" w:unhideWhenUsed="1"/>
+    <w:lsdException w:name="Table Subtle 2" w:semiHidden="1" w:unhideWhenUsed="1"/>
+    <w:lsdException w:name="Table Web 1" w:semiHidden="1" w:unhideWhenUsed="1"/>
+    <w:lsdException w:name="Table Web 2" w:semiHidden="1" w:unhideWhenUsed="1"/>
+    <w:lsdException w:name="Table Web 3" w:semiHidden="1" w:unhideWhenUsed="1"/>
+    <w:lsdException w:name="Balloon Text" w:semiHidden="1" w:unhideWhenUsed="1"/>
+    <w:lsdException w:name="Table Grid" w:uiPriority="39"/>
+    <w:lsdException w:name="Table Theme" w:semiHidden="1" w:unhideWhenUsed="1"/>
+    <w:lsdException w:name="Placeholder Text" w:semiHidden="1"/>
+    <w:lsdException w:name="No Spacing" w:uiPriority="1" w:qFormat="1"/>
+    <w:lsdException w:name="Light Shading" w:uiPriority="60"/>
+    <w:lsdException w:name="Light List" w:uiPriority="61"/>
+    <w:lsdException w:name="Light Grid" w:uiPriority="62"/>
+    <w:lsdException w:name="Medium Shading 1" w:uiPriority="63"/>
+    <w:lsdException w:name="Medium Shading 2" w:uiPriority="64"/>
+    <w:lsdException w:name="Medium List 1" w:uiPriority="65"/>
+    <w:lsdException w:name="Medium List 2" w:uiPriority="66"/>
+    <w:lsdException w:name="Medium Grid 1" w:uiPriority="67"/>
+    <w:lsdException w:name="Medium Grid 2" w:uiPriority="68"/>
+    <w:lsdException w:name="Medium Grid 3" w:uiPriority="69"/>
+    <w:lsdException w:name="Dark List" w:uiPriority="70"/>
+    <w:lsdException w:name="Colorful Shading" w:uiPriority="71"/>
+    <w:lsdException w:name="Colorful List" w:uiPriority="72"/>
+    <w:lsdException w:name="Colorful Grid" w:uiPriority="73"/>
+    <w:lsdException w:name="Light Shading Accent 1" w:uiPriority="60"/>
+    <w:lsdException w:name="Light List Accent 1" w:uiPriority="61"/>
+    <w:lsdException w:name="Light Grid Accent 1" w:uiPriority="62"/>
+    <w:lsdException w:name="Medium Shading 1 Accent 1" w:uiPriority="63"/>
+    <w:lsdException w:name="Medium Shading 2 Accent 1" w:uiPriority="64"/>
+    <w:lsdException w:name="Medium List 1 Accent 1" w:uiPriority="65"/>
+    <w:lsdException w:name="Revision" w:semiHidden="1"/>
+    <w:lsdException w:name="List Paragraph" w:uiPriority="34" w:qFormat="1"/>
+    <w:lsdException w:name="Quote" w:uiPriority="29" w:qFormat="1"/>
+    <w:lsdException w:name="Intense Quote" w:uiPriority="30" w:qFormat="1"/>
+    <w:lsdException w:name="Medium List 2 Accent 1" w:uiPriority="66"/>
+    <w:lsdException w:name="Medium Grid 1 Accent 1" w:uiPriority="67"/>
+    <w:lsdException w:name="Medium Grid 2 Accent 1" w:uiPriority="68"/>
+    <w:lsdException w:name="Medium Grid 3 Accent 1" w:uiPriority="69"/>
+    <w:lsdException w:name="Dark List Accent 1" w:uiPriority="70"/>
+    <w:lsdException w:name="Colorful Shading Accent 1" w:uiPriority="71"/>
+    <w:lsdException w:name="Colorful List Accent 1" w:uiPriority="72"/>
+    <w:lsdException w:name="Colorful Grid Accent 1" w:uiPriority="73"/>
+    <w:lsdException w:name="Light Shading Accent 2" w:uiPriority="60"/>
+    <w:lsdException w:name="Light List Accent 2" w:uiPriority="61"/>
+    <w:lsdException w:name="Light Grid Accent 2" w:uiPriority="62"/>
+    <w:lsdException w:name="Medium Shading 1 Accent 2" w:uiPriority="63"/>
+    <w:lsdException w:name="Medium Shading 2 Accent 2" w:uiPriority="64"/>
+    <w:lsdException w:name="Medium List 1 Accent 2" w:uiPriority="65"/>
+    <w:lsdException w:name="Medium List 2 Accent 2" w:uiPriority="66"/>
+    <w:lsdException w:name="Medium Grid 1 Accent 2" w:uiPriority="67"/>
+    <w:lsdException w:name="Medium Grid 2 Accent 2" w:uiPriority="68"/>
+    <w:lsdException w:name="Medium Grid 3 Accent 2" w:uiPriority="69"/>
+    <w:lsdException w:name="Dark List Accent 2" w:uiPriority="70"/>
+    <w:lsdException w:name="Colorful Shading Accent 2" w:uiPriority="71"/>
+    <w:lsdException w:name="Colorful List Accent 2" w:uiPriority="72"/>
+    <w:lsdException w:name="Colorful Grid Accent 2" w:uiPriority="73"/>
+    <w:lsdException w:name="Light Shading Accent 3" w:uiPriority="60"/>
+    <w:lsdException w:name="Light List Accent 3" w:uiPriority="61"/>
+    <w:lsdException w:name="Light Grid Accent 3" w:uiPriority="62"/>
+    <w:lsdException w:name="Medium Shading 1 Accent 3" w:uiPriority="63"/>
+    <w:lsdException w:name="Medium Shading 2 Accent 3" w:uiPriority="64"/>
+    <w:lsdException w:name="Medium List 1 Accent 3" w:uiPriority="65"/>
+    <w:lsdException w:name="Medium List 2 Accent 3" w:uiPriority="66"/>
+    <w:lsdException w:name="Medium Grid 1 Accent 3" w:uiPriority="67"/>
+    <w:lsdException w:name="Medium Grid 2 Accent 3" w:uiPriority="68"/>
+    <w:lsdException w:name="Medium Grid 3 Accent 3" w:uiPriority="69"/>
+    <w:lsdException w:name="Dark List Accent 3" w:uiPriority="70"/>
+    <w:lsdException w:name="Colorful Shading Accent 3" w:uiPriority="71"/>
+    <w:lsdException w:name="Colorful List Accent 3" w:uiPriority="72"/>
+    <w:lsdException w:name="Colorful Grid Accent 3" w:uiPriority="73"/>
+    <w:lsdException w:name="Light Shading Accent 4" w:uiPriority="60"/>
+    <w:lsdException w:name="Light List Accent 4" w:uiPriority="61"/>
+    <w:lsdException w:name="Light Grid Accent 4" w:uiPriority="62"/>
+    <w:lsdException w:name="Medium Shading 1 Accent 4" w:uiPriority="63"/>
+    <w:lsdException w:name="Medium Shading 2 Accent 4" w:uiPriority="64"/>
+    <w:lsdException w:name="Medium List 1 Accent 4" w:uiPriority="65"/>
+    <w:lsdException w:name="Medium List 2 Accent 4" w:uiPriority="66"/>
+    <w:lsdException w:name="Medium Grid 1 Accent 4" w:uiPriority="67"/>
+    <w:lsdException w:name="Medium Grid 2 Accent 4" w:uiPriority="68"/>
+    <w:lsdException w:name="Medium Grid 3 Accent 4" w:uiPriority="69"/>
+    <w:lsdException w:name="Dark List Accent 4" w:uiPriority="70"/>
+    <w:lsdException w:name="Colorful Shading Accent 4" w:uiPriority="71"/>
+    <w:lsdException w:name="Colorful List Accent 4" w:uiPriority="72"/>
+    <w:lsdException w:name="Colorful Grid Accent 4" w:uiPriority="73"/>
+    <w:lsdException w:name="Light Shading Accent 5" w:uiPriority="60"/>
+    <w:lsdException w:name="Light List Accent 5" w:uiPriority="61"/>
+    <w:lsdException w:name="Light Grid Accent 5" w:uiPriority="62"/>
+    <w:lsdException w:name="Medium Shading 1 Accent 5" w:uiPriority="63"/>
+    <w:lsdException w:name="Medium Shading 2 Accent 5" w:uiPriority="64"/>
+    <w:lsdException w:name="Medium List 1 Accent 5" w:uiPriority="65"/>
+    <w:lsdException w:name="Medium List 2 Accent 5" w:uiPriority="66"/>
+    <w:lsdException w:name="Medium Grid 1 Accent 5" w:uiPriority="67"/>
+    <w:lsdException w:name="Medium Grid 2 Accent 5" w:uiPriority="68"/>
+    <w:lsdException w:name="Medium Grid 3 Accent 5" w:uiPriority="69"/>
+    <w:lsdException w:name="Dark List Accent 5" w:uiPriority="70"/>
+    <w:lsdException w:name="Colorful Shading Accent 5" w:uiPriority="71"/>
+    <w:lsdException w:name="Colorful List Accent 5" w:uiPriority="72"/>
+    <w:lsdException w:name="Colorful Grid Accent 5" w:uiPriority="73"/>
+    <w:lsdException w:name="Light Shading Accent 6" w:uiPriority="60"/>
+    <w:lsdException w:name="Light List Accent 6" w:uiPriority="61"/>
+    <w:lsdException w:name="Light Grid Accent 6" w:uiPriority="62"/>
+    <w:lsdException w:name="Medium Shading 1 Accent 6" w:uiPriority="63"/>
+    <w:lsdException w:name="Medium Shading 2 Accent 6" w:uiPriority="64"/>
+    <w:lsdException w:name="Medium List 1 Accent 6" w:uiPriority="65"/>
+    <w:lsdException w:name="Medium List 2 Accent 6" w:uiPriority="66"/>
+    <w:lsdException w:name="Medium Grid 1 Accent 6" w:uiPriority="67"/>
+    <w:lsdException w:name="Medium Grid 2 Accent 6" w:uiPriority="68"/>
+    <w:lsdException w:name="Medium Grid 3 Accent 6" w:uiPriority="69"/>
+    <w:lsdException w:name="Dark List Accent 6" w:uiPriority="70"/>
+    <w:lsdException w:name="Colorful Shading Accent 6" w:uiPriority="71"/>
+    <w:lsdException w:name="Colorful List Accent 6" w:uiPriority="72"/>
+    <w:lsdException w:name="Colorful Grid Accent 6" w:uiPriority="73"/>
+    <w:lsdException w:name="Subtle Emphasis" w:uiPriority="19" w:qFormat="1"/>
+    <w:lsdException w:name="Intense Emphasis" w:uiPriority="21" w:qFormat="1"/>
+    <w:lsdException w:name="Subtle Reference" w:uiPriority="31" w:qFormat="1"/>
+    <w:lsdException w:name="Intense Reference" w:uiPriority="32" w:qFormat="1"/>
+    <w:lsdException w:name="Book Title" w:uiPriority="33" w:qFormat="1"/>
+    <w:lsdException w:name="Bibliography" w:semiHidden="1" w:uiPriority="37" w:unhideWhenUsed="1"/>
+    <w:lsdException w:name="TOC Heading" w:semiHidden="1" w:uiPriority="39" w:unhideWhenUsed="1" w:qFormat="1"/>
+    <w:lsdException w:name="Plain Table 1" w:uiPriority="41"/>
+    <w:lsdException w:name="Plain Table 2" w:uiPriority="42"/>
+    <w:lsdException w:name="Plain Table 3" w:uiPriority="43"/>
+    <w:lsdException w:name="Plain Table 4" w:uiPriority="44"/>
+    <w:lsdException w:name="Plain Table 5" w:uiPriority="45"/>
+    <w:lsdException w:name="Grid Table Light" w:uiPriority="40"/>
+    <w:lsdException w:name="Grid Table 1 Light" w:uiPriority="46"/>
+    <w:lsdException w:name="Grid Table 2" w:uiPriority="47"/>
+    <w:lsdException w:name="Grid Table 3" w:uiPriority="48"/>
+    <w:lsdException w:name="Grid Table 4" w:uiPriority="49"/>
+    <w:lsdException w:name="Grid Table 5 Dark" w:uiPriority="50"/>
+    <w:lsdException w:name="Grid Table 6 Colorful" w:uiPriority="51"/>
+    <w:lsdException w:name="Grid Table 7 Colorful" w:uiPriority="52"/>
+    <w:lsdException w:name="Grid Table 1 Light Accent 1" w:uiPriority="46"/>
+    <w:lsdException w:name="Grid Table 2 Accent 1" w:uiPriority="47"/>
+    <w:lsdException w:name="Grid Table 3 Accent 1" w:uiPriority="48"/>
+    <w:lsdException w:name="Grid Table 4 Accent 1" w:uiPriority="49"/>
+    <w:lsdException w:name="Grid Table 5 Dark Accent 1" w:uiPriority="50"/>
+    <w:lsdException w:name="Grid Table 6 Colorful Accent 1" w:uiPriority="51"/>
+    <w:lsdException w:name="Grid Table 7 Colorful Accent 1" w:uiPriority="52"/>
+    <w:lsdException w:name="Grid Table 1 Light Accent 2" w:uiPriority="46"/>
+    <w:lsdException w:name="Grid Table 2 Accent 2" w:uiPriority="47"/>
+    <w:lsdException w:name="Grid Table 3 Accent 2" w:uiPriority="48"/>
+    <w:lsdException w:name="Grid Table 4 Accent 2" w:uiPriority="49"/>
+    <w:lsdException w:name="Grid Table 5 Dark Accent 2" w:uiPriority="50"/>
+    <w:lsdException w:name="Grid Table 6 Colorful Accent 2" w:uiPriority="51"/>
+    <w:lsdException w:name="Grid Table 7 Colorful Accent 2" w:uiPriority="52"/>
+    <w:lsdException w:name="Grid Table 1 Light Accent 3" w:uiPriority="46"/>
+    <w:lsdException w:name="Grid Table 2 Accent 3" w:uiPriority="47"/>
+    <w:lsdException w:name="Grid Table 3 Accent 3" w:uiPriority="48"/>
+    <w:lsdException w:name="Grid Table 4 Accent 3" w:uiPriority="49"/>
+    <w:lsdException w:name="Grid Table 5 Dark Accent 3" w:uiPriority="50"/>
+    <w:lsdException w:name="Grid Table 6 Colorful Accent 3" w:uiPriority="51"/>
+    <w:lsdException w:name="Grid Table 7 Colorful Accent 3" w:uiPriority="52"/>
+    <w:lsdException w:name="Grid Table 1 Light Accent 4" w:uiPriority="46"/>
+    <w:lsdException w:name="Grid Table 2 Accent 4" w:uiPriority="47"/>
+    <w:lsdException w:name="Grid Table 3 Accent 4" w:uiPriority="48"/>
+    <w:lsdException w:name="Grid Table 4 Accent 4" w:uiPriority="49"/>
+    <w:lsdException w:name="Grid Table 5 Dark Accent 4" w:uiPriority="50"/>
+    <w:lsdException w:name="Grid Table 6 Colorful Accent 4" w:uiPriority="51"/>
+    <w:lsdException w:name="Grid Table 7 Colorful Accent 4" w:uiPriority="52"/>
+    <w:lsdException w:name="Grid Table 1 Light Accent 5" w:uiPriority="46"/>
+    <w:lsdException w:name="Grid Table 2 Accent 5" w:uiPriority="47"/>
+    <w:lsdException w:name="Grid Table 3 Accent 5" w:uiPriority="48"/>
+    <w:lsdException w:name="Grid Table 4 Accent 5" w:uiPriority="49"/>
+    <w:lsdException w:name="Grid Table 5 Dark Accent 5" w:uiPriority="50"/>
+    <w:lsdException w:name="Grid Table 6 Colorful Accent 5" w:uiPriority="51"/>
+    <w:lsdException w:name="Grid Table 7 Colorful Accent 5" w:uiPriority="52"/>
+    <w:lsdException w:name="Grid Table 1 Light Accent 6" w:uiPriority="46"/>
+    <w:lsdException w:name="Grid Table 2 Accent 6" w:uiPriority="47"/>
+    <w:lsdException w:name="Grid Table 3 Accent 6" w:uiPriority="48"/>
+    <w:lsdException w:name="Grid Table 4 Accent 6" w:uiPriority="49"/>
+    <w:lsdException w:name="Grid Table 5 Dark Accent 6" w:uiPriority="50"/>
+    <w:lsdException w:name="Grid Table 6 Colorful Accent 6" w:uiPriority="51"/>
+    <w:lsdException w:name="Grid Table 7 Colorful Accent 6" w:uiPriority="52"/>
+    <w:lsdException w:name="List Table 1 Light" w:uiPriority="46"/>
+    <w:lsdException w:name="List Table 2" w:uiPriority="47"/>
+    <w:lsdException w:name="List Table 3" w:uiPriority="48"/>
+    <w:lsdException w:name="List Table 4" w:uiPriority="49"/>
+    <w:lsdException w:name="List Table 5 Dark" w:uiPriority="50"/>
+    <w:lsdException w:name="List Table 6 Colorful" w:uiPriority="51"/>
+    <w:lsdException w:name="List Table 7 Colorful" w:uiPriority="52"/>
+    <w:lsdException w:name="List Table 1 Light Accent 1" w:uiPriority="46"/>
+    <w:lsdException w:name="List Table 2 Accent 1" w:uiPriority="47"/>
+    <w:lsdException w:name="List Table 3 Accent 1" w:uiPriority="48"/>
+    <w:lsdException w:name="List Table 4 Accent 1" w:uiPriority="49"/>
+    <w:lsdException w:name="List Table 5 Dark Accent 1" w:uiPriority="50"/>
+    <w:lsdException w:name="List Table 6 Colorful Accent 1" w:uiPriority="51"/>
+    <w:lsdException w:name="List Table 7 Colorful Accent 1" w:uiPriority="52"/>
+    <w:lsdException w:name="List Table 1 Light Accent 2" w:uiPriority="46"/>
+    <w:lsdException w:name="List Table 2 Accent 2" w:uiPriority="47"/>
+    <w:lsdException w:name="List Table 3 Accent 2" w:uiPriority="48"/>
+    <w:lsdException w:name="List Table 4 Accent 2" w:uiPriority="49"/>
+    <w:lsdException w:name="List Table 5 Dark Accent 2" w:uiPriority="50"/>
+    <w:lsdException w:name="List Table 6 Colorful Accent 2" w:uiPriority="51"/>
+    <w:lsdException w:name="List Table 7 Colorful Accent 2" w:uiPriority="52"/>
+    <w:lsdException w:name="List Table 1 Light Accent 3" w:uiPriority="46"/>
+    <w:lsdException w:name="List Table 2 Accent 3" w:uiPriority="47"/>
+    <w:lsdException w:name="List Table 3 Accent 3" w:uiPriority="48"/>
+    <w:lsdException w:name="List Table 4 Accent 3" w:uiPriority="49"/>
+    <w:lsdException w:name="List Table 5 Dark Accent 3" w:uiPriority="50"/>
+    <w:lsdException w:name="List Table 6 Colorful Accent 3" w:uiPriority="51"/>
+    <w:lsdException w:name="List Table 7 Colorful Accent 3" w:uiPriority="52"/>
+    <w:lsdException w:name="List Table 1 Light Accent 4" w:uiPriority="46"/>
+    <w:lsdException w:name="List Table 2 Accent 4" w:uiPriority="47"/>
+    <w:lsdException w:name="List Table 3 Accent 4" w:uiPriority="48"/>
+    <w:lsdException w:name="List Table 4 Accent 4" w:uiPriority="49"/>
+    <w:lsdException w:name="List Table 5 Dark Accent 4" w:uiPriority="50"/>
+    <w:lsdException w:name="List Table 6 Colorful Accent 4" w:uiPriority="51"/>
+    <w:lsdException w:name="List Table 7 Colorful Accent 4" w:uiPriority="52"/>
+    <w:lsdException w:name="List Table 1 Light Accent 5" w:uiPriority="46"/>
+    <w:lsdException w:name="List Table 2 Accent 5" w:uiPriority="47"/>
+    <w:lsdException w:name="List Table 3 Accent 5" w:uiPriority="48"/>
+    <w:lsdException w:name="List Table 4 Accent 5" w:uiPriority="49"/>
+    <w:lsdException w:name="List Table 5 Dark Accent 5" w:uiPriority="50"/>
+    <w:lsdException w:name="List Table 6 Colorful Accent 5" w:uiPriority="51"/>
+    <w:lsdException w:name="List Table 7 Colorful Accent 5" w:uiPriority="52"/>
+    <w:lsdException w:name="List Table 1 Light Accent 6" w:uiPriority="46"/>
+    <w:lsdException w:name="List Table 2 Accent 6" w:uiPriority="47"/>
+    <w:lsdException w:name="List Table 3 Accent 6" w:uiPriority="48"/>
+    <w:lsdException w:name="List Table 4 Accent 6" w:uiPriority="49"/>
+    <w:lsdException w:name="List Table 5 Dark Accent 6" w:uiPriority="50"/>
+    <w:lsdException w:name="List Table 6 Colorful Accent 6" w:uiPriority="51"/>
+    <w:lsdException w:name="List Table 7 Colorful Accent 6" w:uiPriority="52"/>
+    <w:lsdException w:name="Mention" w:semiHidden="1" w:unhideWhenUsed="1"/>
+    <w:lsdException w:name="Smart Hyperlink" w:semiHidden="1" w:unhideWhenUsed="1"/>
+    <w:lsdException w:name="Hashtag" w:semiHidden="1" w:unhideWhenUsed="1"/>
+    <w:lsdException w:name="Unresolved Mention" w:semiHidden="1" w:unhideWhenUsed="1"/>
+    <w:lsdException w:name="Smart Link" w:semiHidden="1" w:unhideWhenUsed="1"/>
+  </w:latentStyles>
+  <w:style w:type="paragraph" w:default="1" w:styleId="Normal">
+    <w:name w:val="Normal"/>
+    <w:qFormat/>
+    <w:rPr>
+      <w:rFonts w:ascii="Cambria" w:eastAsia="Cambria" w:hAnsi="Cambria" w:cs="Cambria"/>
+    </w:rPr>
+  </w:style>
+  <w:style w:type="paragraph" w:styleId="Heading1">
+    <w:name w:val="heading 1"/>
+    <w:basedOn w:val="Normal"/>
+    <w:uiPriority w:val="9"/>
+    <w:qFormat/>
+    <w:pPr>
+      <w:spacing w:before="116"/>
+      <w:outlineLvl w:val="0"/>
+    </w:pPr>
+    <w:rPr>
+      <w:rFonts w:ascii="Calibri Light" w:eastAsia="Calibri Light" w:hAnsi="Calibri Light" w:cs="Calibri Light"/>
+      <w:sz w:val="32"/>
+      <w:szCs w:val="32"/>
+    </w:rPr>
+  </w:style>
+  <w:style w:type="paragraph" w:styleId="Heading2">
+    <w:name w:val="heading 2"/>
+    <w:basedOn w:val="Normal"/>
+    <w:uiPriority w:val="9"/>
+    <w:unhideWhenUsed/>
+    <w:qFormat/>
+    <w:pPr>
+      <w:ind w:left="12"/>
+      <w:outlineLvl w:val="1"/>
+    </w:pPr>
+    <w:rPr>
+      <w:b/>
+      <w:bCs/>
+      <w:sz w:val="28"/>
+      <w:szCs w:val="28"/>
+    </w:rPr>
+  </w:style>
+  <w:style w:type="character" w:default="1" w:styleId="DefaultParagraphFont">
     <w:name w:val="Default Paragraph Font"/>
     <w:uiPriority w:val="1"/>
     <w:semiHidden/>
     <w:unhideWhenUsed/>
   </w:style>
-  <w:style w:styleId="TableNormal" w:default="1" w:type="table">
-    <w:name w:val="Table Normal"/>
-    <w:uiPriority w:val="2"/>
+  <w:style w:type="table" w:default="1" w:styleId="TableNormal">
+    <w:name w:val="Normal Table"/>
+    <w:uiPriority w:val="99"/>
     <w:semiHidden/>
     <w:unhideWhenUsed/>
-    <w:qFormat/>
     <w:tblPr>
       <w:tblInd w:w="0" w:type="dxa"/>
       <w:tblCellMar>
         <w:top w:w="0" w:type="dxa"/>
-        <w:left w:w="0" w:type="dxa"/>
+        <w:left w:w="108" w:type="dxa"/>
         <w:bottom w:w="0" w:type="dxa"/>
-        <w:right w:w="0" w:type="dxa"/>
+        <w:right w:w="108" w:type="dxa"/>
       </w:tblCellMar>
     </w:tblPr>
   </w:style>
-  <w:style w:styleId="NoList" w:default="1" w:type="numbering">
+  <w:style w:type="numbering" w:default="1" w:styleId="NoList">
     <w:name w:val="No List"/>
     <w:uiPriority w:val="99"/>
     <w:semiHidden/>
     <w:unhideWhenUsed/>
   </w:style>
-  <w:style w:default="1" w:styleId="Normal" w:type="paragraph">
-    <w:name w:val="Normal"/>
-    <w:uiPriority w:val="1"/>
-    <w:qFormat/>
-    <w:pPr/>
-    <w:rPr>
-      <w:rFonts w:ascii="Cambria" w:hAnsi="Cambria" w:eastAsia="Cambria" w:cs="Cambria"/>
-      <w:lang w:val="en-US" w:eastAsia="en-US" w:bidi="ar-SA"/>
-    </w:rPr>
-  </w:style>
-  <w:style w:styleId="BodyText" w:type="paragraph">
+  <w:style w:type="paragraph" w:styleId="BodyText">
     <w:name w:val="Body Text"/>
     <w:basedOn w:val="Normal"/>
     <w:uiPriority w:val="1"/>
     <w:qFormat/>
-    <w:pPr/>
     <w:rPr>
-      <w:rFonts w:ascii="Calibri" w:hAnsi="Calibri" w:eastAsia="Calibri" w:cs="Calibri"/>
-      <w:sz w:val="22"/>
-      <w:szCs w:val="22"/>
-      <w:lang w:val="en-US" w:eastAsia="en-US" w:bidi="ar-SA"/>
+      <w:rFonts w:ascii="Calibri" w:eastAsia="Calibri" w:hAnsi="Calibri" w:cs="Calibri"/>
     </w:rPr>
   </w:style>
-  <w:style w:styleId="Heading1" w:type="paragraph">
-    <w:name w:val="Heading 1"/>
-    <w:basedOn w:val="Normal"/>
-    <w:uiPriority w:val="1"/>
-    <w:qFormat/>
-    <w:pPr>
-      <w:spacing w:before="116"/>
-      <w:outlineLvl w:val="1"/>
-    </w:pPr>
-    <w:rPr>
-      <w:rFonts w:ascii="Calibri Light" w:hAnsi="Calibri Light" w:eastAsia="Calibri Light" w:cs="Calibri Light"/>
-      <w:sz w:val="32"/>
-      <w:szCs w:val="32"/>
-      <w:lang w:val="en-US" w:eastAsia="en-US" w:bidi="ar-SA"/>
-    </w:rPr>
-  </w:style>
-  <w:style w:styleId="Heading2" w:type="paragraph">
-    <w:name w:val="Heading 2"/>
-    <w:basedOn w:val="Normal"/>
-    <w:uiPriority w:val="1"/>
-    <w:qFormat/>
-    <w:pPr>
-      <w:ind w:left="12"/>
-      <w:outlineLvl w:val="2"/>
-    </w:pPr>
-    <w:rPr>
-      <w:rFonts w:ascii="Cambria" w:hAnsi="Cambria" w:eastAsia="Cambria" w:cs="Cambria"/>
-      <w:b/>
-      <w:bCs/>
-      <w:sz w:val="28"/>
-      <w:szCs w:val="28"/>
-      <w:lang w:val="en-US" w:eastAsia="en-US" w:bidi="ar-SA"/>
-    </w:rPr>
-  </w:style>
-  <w:style w:styleId="ListParagraph" w:type="paragraph">
+  <w:style w:type="paragraph" w:styleId="ListParagraph">
     <w:name w:val="List Paragraph"/>
     <w:basedOn w:val="Normal"/>
     <w:uiPriority w:val="1"/>
     <w:qFormat/>
-    <w:pPr/>
-    <w:rPr>
-      <w:lang w:val="en-US" w:eastAsia="en-US" w:bidi="ar-SA"/>
-    </w:rPr>
   </w:style>
-  <w:style w:styleId="TableParagraph" w:type="paragraph">
+  <w:style w:type="paragraph" w:customStyle="1" w:styleId="TableParagraph">
     <w:name w:val="Table Paragraph"/>
     <w:basedOn w:val="Normal"/>
     <w:uiPriority w:val="1"/>
     <w:qFormat/>
-    <w:pPr/>
+  </w:style>
+  <w:style w:type="paragraph" w:styleId="Header">
+    <w:name w:val="header"/>
+    <w:basedOn w:val="Normal"/>
+    <w:link w:val="HeaderChar"/>
+    <w:uiPriority w:val="99"/>
+    <w:unhideWhenUsed/>
+    <w:rsid w:val="0083360D"/>
+    <w:pPr>
+      <w:tabs>
+        <w:tab w:val="center" w:pos="4513"/>
+        <w:tab w:val="right" w:pos="9026"/>
+      </w:tabs>
+    </w:pPr>
+  </w:style>
+  <w:style w:type="character" w:customStyle="1" w:styleId="HeaderChar">
+    <w:name w:val="Header Char"/>
+    <w:basedOn w:val="DefaultParagraphFont"/>
+    <w:link w:val="Header"/>
+    <w:uiPriority w:val="99"/>
+    <w:rsid w:val="0083360D"/>
     <w:rPr>
-      <w:lang w:val="en-US" w:eastAsia="en-US" w:bidi="ar-SA"/>
+      <w:rFonts w:ascii="Cambria" w:eastAsia="Cambria" w:hAnsi="Cambria" w:cs="Cambria"/>
+    </w:rPr>
+  </w:style>
+  <w:style w:type="paragraph" w:styleId="Footer">
+    <w:name w:val="footer"/>
+    <w:basedOn w:val="Normal"/>
+    <w:link w:val="FooterChar"/>
+    <w:uiPriority w:val="99"/>
+    <w:unhideWhenUsed/>
+    <w:rsid w:val="0083360D"/>
+    <w:pPr>
+      <w:tabs>
+        <w:tab w:val="center" w:pos="4513"/>
+        <w:tab w:val="right" w:pos="9026"/>
+      </w:tabs>
+    </w:pPr>
+  </w:style>
+  <w:style w:type="character" w:customStyle="1" w:styleId="FooterChar">
+    <w:name w:val="Footer Char"/>
+    <w:basedOn w:val="DefaultParagraphFont"/>
+    <w:link w:val="Footer"/>
+    <w:uiPriority w:val="99"/>
+    <w:rsid w:val="0083360D"/>
+    <w:rPr>
+      <w:rFonts w:ascii="Cambria" w:eastAsia="Cambria" w:hAnsi="Cambria" w:cs="Cambria"/>
     </w:rPr>
   </w:style>
 </w:styles>

</xml_diff>